<commit_message>
feat(clinic): hover highlight + drag-to-size booking on the 10-min grid
Reviewer follow-up: the 10-minute grid wasn't tangible enough. The board's
columns now give direct slot feedback:
- hovering paints the 10-minute cell under the pointer (skipped over events
  and closed time);
- pressing and dragging selects whole cells — two cells = a 20-minute visit,
  etc. — with a live "13:20 – 13:50" label inside the selection; releasing
  opens the new-visit form pre-filled with exactly that range (clamped to the
  working window);
- a plain click still books the default 30-minute slot at the clicked time.
The old click handler (onSlotClick) is fully replaced by
mousemove/leave/down/up handlers; dragging that leaves the column cancels.

Co-Authored-By: Claude Fable 5 <noreply@anthropic.com>
</commit_message>
<xml_diff>
--- a/docs/28.08.26.docx
+++ b/docs/28.08.26.docx
@@ -728,10 +728,10 @@
           <w:noProof/>
         </w:rPr>
         <w:drawing>
-          <wp:inline distT="0" distB="0" distL="0" distR="0" wp14:anchorId="6E0F33CF" wp14:editId="6A61A13E">
+          <wp:inline distT="0" distB="0" distL="0" distR="0" wp14:anchorId="6E0F33CF" wp14:editId="4300C497">
             <wp:extent cx="5727700" cy="3158490"/>
             <wp:effectExtent l="0" t="0" r="6350" b="3810"/>
-            <wp:docPr id="332911534" name="Picture 1"/>
+            <wp:docPr id="332911534" name="Picture 1" descr="The image displays a webpage with a user interface, featuring a search bar, a list of dental services, and patient names, including Dr. Alex and Dr. Michael Brown.&#10;&#10;AI-generated content may be incorrect."/>
             <wp:cNvGraphicFramePr>
               <a:graphicFrameLocks xmlns:a="http://schemas.openxmlformats.org/drawingml/2006/main" noChangeAspect="1"/>
             </wp:cNvGraphicFramePr>
@@ -739,7 +739,7 @@
               <a:graphicData uri="http://schemas.openxmlformats.org/drawingml/2006/picture">
                 <pic:pic xmlns:pic="http://schemas.openxmlformats.org/drawingml/2006/picture">
                   <pic:nvPicPr>
-                    <pic:cNvPr id="332911534" name=""/>
+                    <pic:cNvPr id="332911534" name="Picture 1" descr="The image displays a webpage with a user interface, featuring a search bar, a list of dental services, and patient names, including Dr. Alex and Dr. Michael Brown.&#10;&#10;AI-generated content may be incorrect."/>
                     <pic:cNvPicPr/>
                   </pic:nvPicPr>
                   <pic:blipFill>
@@ -846,7 +846,47 @@
           <w:szCs w:val="22"/>
           <w:lang w:val="ka-GE"/>
         </w:rPr>
-        <w:br/>
+        <w:t xml:space="preserve">  &gt;&gt;&gt; </w:t>
+      </w:r>
+      <w:r>
+        <w:rPr>
+          <w:noProof/>
+        </w:rPr>
+        <w:drawing>
+          <wp:inline distT="0" distB="0" distL="0" distR="0" wp14:anchorId="6350DCF0" wp14:editId="748A6FBA">
+            <wp:extent cx="5727700" cy="3110865"/>
+            <wp:effectExtent l="0" t="0" r="6350" b="0"/>
+            <wp:docPr id="2143364533" name="Picture 1" descr="The image displays a calendar with a date marked as August 30, 2026, and a note indicating a dental appointment with Dr. Alex Morgan and Dr. Michael Brown.&#10;&#10;AI-generated content may be incorrect."/>
+            <wp:cNvGraphicFramePr>
+              <a:graphicFrameLocks xmlns:a="http://schemas.openxmlformats.org/drawingml/2006/main" noChangeAspect="1"/>
+            </wp:cNvGraphicFramePr>
+            <a:graphic xmlns:a="http://schemas.openxmlformats.org/drawingml/2006/main">
+              <a:graphicData uri="http://schemas.openxmlformats.org/drawingml/2006/picture">
+                <pic:pic xmlns:pic="http://schemas.openxmlformats.org/drawingml/2006/picture">
+                  <pic:nvPicPr>
+                    <pic:cNvPr id="2143364533" name="Picture 1" descr="The image displays a calendar with a date marked as August 30, 2026, and a note indicating a dental appointment with Dr. Alex Morgan and Dr. Michael Brown.&#10;&#10;AI-generated content may be incorrect."/>
+                    <pic:cNvPicPr/>
+                  </pic:nvPicPr>
+                  <pic:blipFill>
+                    <a:blip r:embed="rId9"/>
+                    <a:stretch>
+                      <a:fillRect/>
+                    </a:stretch>
+                  </pic:blipFill>
+                  <pic:spPr>
+                    <a:xfrm>
+                      <a:off x="0" y="0"/>
+                      <a:ext cx="5727700" cy="3110865"/>
+                    </a:xfrm>
+                    <a:prstGeom prst="rect">
+                      <a:avLst/>
+                    </a:prstGeom>
+                  </pic:spPr>
+                </pic:pic>
+              </a:graphicData>
+            </a:graphic>
+          </wp:inline>
+        </w:drawing>
       </w:r>
     </w:p>
     <w:p>
@@ -860,12 +900,182 @@
       </w:pPr>
       <w:r>
         <w:rPr>
+          <w:noProof/>
+        </w:rPr>
+        <w:lastRenderedPageBreak/>
+        <w:drawing>
+          <wp:inline distT="0" distB="0" distL="0" distR="0" wp14:anchorId="35845E17" wp14:editId="40758DAD">
+            <wp:extent cx="5727700" cy="2599055"/>
+            <wp:effectExtent l="0" t="0" r="6350" b="0"/>
+            <wp:docPr id="85378135" name="Picture 1" descr="The image displays a webpage or application interface with a search function, showing a cancelled or rescheduled status, and options for customizing search results.&#10;&#10;AI-generated content may be incorrect."/>
+            <wp:cNvGraphicFramePr>
+              <a:graphicFrameLocks xmlns:a="http://schemas.openxmlformats.org/drawingml/2006/main" noChangeAspect="1"/>
+            </wp:cNvGraphicFramePr>
+            <a:graphic xmlns:a="http://schemas.openxmlformats.org/drawingml/2006/main">
+              <a:graphicData uri="http://schemas.openxmlformats.org/drawingml/2006/picture">
+                <pic:pic xmlns:pic="http://schemas.openxmlformats.org/drawingml/2006/picture">
+                  <pic:nvPicPr>
+                    <pic:cNvPr id="85378135" name="Picture 1" descr="The image displays a webpage or application interface with a search function, showing a cancelled or rescheduled status, and options for customizing search results.&#10;&#10;AI-generated content may be incorrect."/>
+                    <pic:cNvPicPr/>
+                  </pic:nvPicPr>
+                  <pic:blipFill>
+                    <a:blip r:embed="rId10"/>
+                    <a:stretch>
+                      <a:fillRect/>
+                    </a:stretch>
+                  </pic:blipFill>
+                  <pic:spPr>
+                    <a:xfrm>
+                      <a:off x="0" y="0"/>
+                      <a:ext cx="5727700" cy="2599055"/>
+                    </a:xfrm>
+                    <a:prstGeom prst="rect">
+                      <a:avLst/>
+                    </a:prstGeom>
+                  </pic:spPr>
+                </pic:pic>
+              </a:graphicData>
+            </a:graphic>
+          </wp:inline>
+        </w:drawing>
+      </w:r>
+      <w:r>
+        <w:rPr>
+          <w:rFonts w:ascii="Helvetica" w:hAnsi="Helvetica"/>
+          <w:sz w:val="22"/>
+          <w:szCs w:val="22"/>
+          <w:lang w:val="ka-GE"/>
+        </w:rPr>
+        <w:br/>
+      </w:r>
+    </w:p>
+    <w:p>
+      <w:pPr>
+        <w:rPr>
+          <w:rFonts w:ascii="Helvetica" w:hAnsi="Helvetica"/>
+          <w:sz w:val="22"/>
+          <w:szCs w:val="22"/>
+          <w:lang w:val="ka-GE"/>
+        </w:rPr>
+      </w:pPr>
+      <w:r>
+        <w:rPr>
           <w:rFonts w:ascii="Helvetica" w:hAnsi="Helvetica"/>
           <w:sz w:val="22"/>
           <w:szCs w:val="22"/>
           <w:lang w:val="ka-GE"/>
         </w:rPr>
         <w:t>კალენდარში გვიჩანდეს პაციენტის სახელი და გვარი (და არა მანიპულაცია) - შესაბამისი ფერით მოინიშნება მანიპულაცია</w:t>
+      </w:r>
+      <w:r>
+        <w:rPr>
+          <w:rFonts w:ascii="Helvetica" w:hAnsi="Helvetica"/>
+          <w:sz w:val="22"/>
+          <w:szCs w:val="22"/>
+          <w:lang w:val="ka-GE"/>
+        </w:rPr>
+        <w:t xml:space="preserve"> &gt;&gt; </w:t>
+      </w:r>
+      <w:r>
+        <w:rPr>
+          <w:noProof/>
+        </w:rPr>
+        <w:drawing>
+          <wp:inline distT="0" distB="0" distL="0" distR="0" wp14:anchorId="755AE69A" wp14:editId="37526C22">
+            <wp:extent cx="3686175" cy="1076325"/>
+            <wp:effectExtent l="0" t="0" r="9525" b="9525"/>
+            <wp:docPr id="907937825" name="Picture 1" descr="The image displays a calendar or schedule with a time entry for Ava Garcia from 13:20 to 13:50.&#10;&#10;AI-generated content may be incorrect."/>
+            <wp:cNvGraphicFramePr>
+              <a:graphicFrameLocks xmlns:a="http://schemas.openxmlformats.org/drawingml/2006/main" noChangeAspect="1"/>
+            </wp:cNvGraphicFramePr>
+            <a:graphic xmlns:a="http://schemas.openxmlformats.org/drawingml/2006/main">
+              <a:graphicData uri="http://schemas.openxmlformats.org/drawingml/2006/picture">
+                <pic:pic xmlns:pic="http://schemas.openxmlformats.org/drawingml/2006/picture">
+                  <pic:nvPicPr>
+                    <pic:cNvPr id="907937825" name="Picture 1" descr="The image displays a calendar or schedule with a time entry for Ava Garcia from 13:20 to 13:50.&#10;&#10;AI-generated content may be incorrect."/>
+                    <pic:cNvPicPr/>
+                  </pic:nvPicPr>
+                  <pic:blipFill>
+                    <a:blip r:embed="rId11"/>
+                    <a:stretch>
+                      <a:fillRect/>
+                    </a:stretch>
+                  </pic:blipFill>
+                  <pic:spPr>
+                    <a:xfrm>
+                      <a:off x="0" y="0"/>
+                      <a:ext cx="3686175" cy="1076325"/>
+                    </a:xfrm>
+                    <a:prstGeom prst="rect">
+                      <a:avLst/>
+                    </a:prstGeom>
+                  </pic:spPr>
+                </pic:pic>
+              </a:graphicData>
+            </a:graphic>
+          </wp:inline>
+        </w:drawing>
+      </w:r>
+      <w:r>
+        <w:rPr>
+          <w:rFonts w:ascii="Helvetica" w:hAnsi="Helvetica"/>
+          <w:sz w:val="22"/>
+          <w:szCs w:val="22"/>
+          <w:lang w:val="ka-GE"/>
+        </w:rPr>
+        <w:t xml:space="preserve">  </w:t>
+      </w:r>
+      <w:r>
+        <w:rPr>
+          <w:rFonts w:ascii="Sylfaen" w:hAnsi="Sylfaen"/>
+          <w:sz w:val="22"/>
+          <w:szCs w:val="22"/>
+          <w:lang w:val="ka-GE"/>
+        </w:rPr>
+        <w:t>და ისარს რო მიიტან ჩანს მანიპულაციაც &gt;&gt;</w:t>
+      </w:r>
+      <w:r>
+        <w:rPr>
+          <w:rFonts w:ascii="Sylfaen" w:hAnsi="Sylfaen"/>
+          <w:sz w:val="22"/>
+          <w:szCs w:val="22"/>
+          <w:lang w:val="ka-GE"/>
+        </w:rPr>
+        <w:drawing>
+          <wp:inline distT="0" distB="0" distL="0" distR="0" wp14:anchorId="49D00833" wp14:editId="01141814">
+            <wp:extent cx="3334215" cy="952633"/>
+            <wp:effectExtent l="0" t="0" r="0" b="0"/>
+            <wp:docPr id="931567907" name="Picture 1" descr="Extraction.&#10;&#10;AI-generated content may be incorrect."/>
+            <wp:cNvGraphicFramePr>
+              <a:graphicFrameLocks xmlns:a="http://schemas.openxmlformats.org/drawingml/2006/main" noChangeAspect="1"/>
+            </wp:cNvGraphicFramePr>
+            <a:graphic xmlns:a="http://schemas.openxmlformats.org/drawingml/2006/main">
+              <a:graphicData uri="http://schemas.openxmlformats.org/drawingml/2006/picture">
+                <pic:pic xmlns:pic="http://schemas.openxmlformats.org/drawingml/2006/picture">
+                  <pic:nvPicPr>
+                    <pic:cNvPr id="931567907" name="Picture 1" descr="Extraction.&#10;&#10;AI-generated content may be incorrect."/>
+                    <pic:cNvPicPr/>
+                  </pic:nvPicPr>
+                  <pic:blipFill>
+                    <a:blip r:embed="rId12"/>
+                    <a:stretch>
+                      <a:fillRect/>
+                    </a:stretch>
+                  </pic:blipFill>
+                  <pic:spPr>
+                    <a:xfrm>
+                      <a:off x="0" y="0"/>
+                      <a:ext cx="3334215" cy="952633"/>
+                    </a:xfrm>
+                    <a:prstGeom prst="rect">
+                      <a:avLst/>
+                    </a:prstGeom>
+                  </pic:spPr>
+                </pic:pic>
+              </a:graphicData>
+            </a:graphic>
+          </wp:inline>
+        </w:drawing>
       </w:r>
       <w:r>
         <w:rPr>
@@ -885,6 +1095,110 @@
         </w:rPr>
         <w:br/>
         <w:t>სტატუსებს - „გადახდილი“ და „ჩატარებული“ - სხვადასხვა ფერი ჰქონდეს კალენდარზე (ორივე მწვანეა ახლა)</w:t>
+      </w:r>
+      <w:r>
+        <w:rPr>
+          <w:rFonts w:ascii="Helvetica" w:hAnsi="Helvetica"/>
+          <w:sz w:val="22"/>
+          <w:szCs w:val="22"/>
+          <w:lang w:val="ka-GE"/>
+        </w:rPr>
+        <w:t xml:space="preserve"> &gt;&gt; </w:t>
+      </w:r>
+      <w:r>
+        <w:rPr>
+          <w:rFonts w:ascii="Helvetica" w:hAnsi="Helvetica"/>
+          <w:sz w:val="22"/>
+          <w:szCs w:val="22"/>
+          <w:lang w:val="ka-GE"/>
+        </w:rPr>
+        <w:drawing>
+          <wp:inline distT="0" distB="0" distL="0" distR="0" wp14:anchorId="1C482A68" wp14:editId="178F9AFF">
+            <wp:extent cx="3419952" cy="762106"/>
+            <wp:effectExtent l="0" t="0" r="9525" b="0"/>
+            <wp:docPr id="627101765" name="Picture 1"/>
+            <wp:cNvGraphicFramePr>
+              <a:graphicFrameLocks xmlns:a="http://schemas.openxmlformats.org/drawingml/2006/main" noChangeAspect="1"/>
+            </wp:cNvGraphicFramePr>
+            <a:graphic xmlns:a="http://schemas.openxmlformats.org/drawingml/2006/main">
+              <a:graphicData uri="http://schemas.openxmlformats.org/drawingml/2006/picture">
+                <pic:pic xmlns:pic="http://schemas.openxmlformats.org/drawingml/2006/picture">
+                  <pic:nvPicPr>
+                    <pic:cNvPr id="627101765" name=""/>
+                    <pic:cNvPicPr/>
+                  </pic:nvPicPr>
+                  <pic:blipFill>
+                    <a:blip r:embed="rId13"/>
+                    <a:stretch>
+                      <a:fillRect/>
+                    </a:stretch>
+                  </pic:blipFill>
+                  <pic:spPr>
+                    <a:xfrm>
+                      <a:off x="0" y="0"/>
+                      <a:ext cx="3419952" cy="762106"/>
+                    </a:xfrm>
+                    <a:prstGeom prst="rect">
+                      <a:avLst/>
+                    </a:prstGeom>
+                  </pic:spPr>
+                </pic:pic>
+              </a:graphicData>
+            </a:graphic>
+          </wp:inline>
+        </w:drawing>
+      </w:r>
+      <w:r>
+        <w:rPr>
+          <w:rFonts w:ascii="Helvetica" w:hAnsi="Helvetica"/>
+          <w:sz w:val="22"/>
+          <w:szCs w:val="22"/>
+          <w:lang w:val="ka-GE"/>
+        </w:rPr>
+        <w:t xml:space="preserve"> &gt;&gt;</w:t>
+      </w:r>
+      <w:r>
+        <w:rPr>
+          <w:rFonts w:ascii="Helvetica" w:hAnsi="Helvetica"/>
+          <w:sz w:val="22"/>
+          <w:szCs w:val="22"/>
+          <w:lang w:val="ka-GE"/>
+        </w:rPr>
+        <w:drawing>
+          <wp:inline distT="0" distB="0" distL="0" distR="0" wp14:anchorId="2083CEB7" wp14:editId="75EEA9CD">
+            <wp:extent cx="3381847" cy="695422"/>
+            <wp:effectExtent l="0" t="0" r="9525" b="9525"/>
+            <wp:docPr id="825699917" name="Picture 1" descr="Ava Garcia&#10;&#10;AI-generated content may be incorrect."/>
+            <wp:cNvGraphicFramePr>
+              <a:graphicFrameLocks xmlns:a="http://schemas.openxmlformats.org/drawingml/2006/main" noChangeAspect="1"/>
+            </wp:cNvGraphicFramePr>
+            <a:graphic xmlns:a="http://schemas.openxmlformats.org/drawingml/2006/main">
+              <a:graphicData uri="http://schemas.openxmlformats.org/drawingml/2006/picture">
+                <pic:pic xmlns:pic="http://schemas.openxmlformats.org/drawingml/2006/picture">
+                  <pic:nvPicPr>
+                    <pic:cNvPr id="825699917" name="Picture 1" descr="Ava Garcia&#10;&#10;AI-generated content may be incorrect."/>
+                    <pic:cNvPicPr/>
+                  </pic:nvPicPr>
+                  <pic:blipFill>
+                    <a:blip r:embed="rId14"/>
+                    <a:stretch>
+                      <a:fillRect/>
+                    </a:stretch>
+                  </pic:blipFill>
+                  <pic:spPr>
+                    <a:xfrm>
+                      <a:off x="0" y="0"/>
+                      <a:ext cx="3381847" cy="695422"/>
+                    </a:xfrm>
+                    <a:prstGeom prst="rect">
+                      <a:avLst/>
+                    </a:prstGeom>
+                  </pic:spPr>
+                </pic:pic>
+              </a:graphicData>
+            </a:graphic>
+          </wp:inline>
+        </w:drawing>
       </w:r>
     </w:p>
     <w:p>
@@ -1162,6 +1476,7 @@
           <w:szCs w:val="22"/>
           <w:lang w:val="ka-GE"/>
         </w:rPr>
+        <w:lastRenderedPageBreak/>
         <w:t xml:space="preserve">დაბადების თარიღი - </w:t>
       </w:r>
       <w:r>
@@ -1329,7 +1644,6 @@
           <w:szCs w:val="22"/>
           <w:lang w:val="ka-GE"/>
         </w:rPr>
-        <w:lastRenderedPageBreak/>
         <w:t>ადგილზე მოსული პაციენტი ისე ვერ უნდა გადადიოდეს მიმდინარეში - თუ შევსებული არ იქნება მისი პირადი მონაცემები.</w:t>
       </w:r>
       <w:r>
@@ -1772,7 +2086,7 @@
                     <pic:cNvPicPr/>
                   </pic:nvPicPr>
                   <pic:blipFill>
-                    <a:blip r:embed="rId9">
+                    <a:blip r:embed="rId15">
                       <a:extLst>
                         <a:ext uri="{28A0092B-C50C-407E-A947-70E740481C1C}">
                           <a14:useLocalDpi xmlns:a14="http://schemas.microsoft.com/office/drawing/2010/main" val="0"/>
@@ -1891,6 +2205,7 @@
           <w:szCs w:val="22"/>
           <w:lang w:val="ka-GE"/>
         </w:rPr>
+        <w:lastRenderedPageBreak/>
         <w:br/>
         <w:t>თუ მიმდინარე პაციენტთან დროის ხანგრძლივობა შეიცვალა - კალენდარზე უნდა ჩანდეს რომ დაკორექტირდა</w:t>
       </w:r>
@@ -2047,7 +2362,6 @@
           <w:szCs w:val="22"/>
           <w:lang w:val="ka-GE"/>
         </w:rPr>
-        <w:lastRenderedPageBreak/>
         <w:br/>
       </w:r>
       <w:r>
@@ -4418,6 +4732,7 @@
                 <w:sz w:val="22"/>
                 <w:szCs w:val="22"/>
               </w:rPr>
+              <w:lastRenderedPageBreak/>
               <w:t>პირადი</w:t>
             </w:r>
             <w:r>
@@ -4511,6 +4826,7 @@
                 <w:sz w:val="22"/>
                 <w:szCs w:val="22"/>
               </w:rPr>
+              <w:lastRenderedPageBreak/>
               <w:t>✅</w:t>
             </w:r>
             <w:r>
@@ -7955,7 +8271,6 @@
                 <w:sz w:val="22"/>
                 <w:szCs w:val="22"/>
               </w:rPr>
-              <w:lastRenderedPageBreak/>
               <w:t>ვიზიტები</w:t>
             </w:r>
             <w:r>
@@ -8125,7 +8440,6 @@
                 <w:sz w:val="22"/>
                 <w:szCs w:val="22"/>
               </w:rPr>
-              <w:lastRenderedPageBreak/>
               <w:t>„</w:t>
             </w:r>
             <w:r>
@@ -8936,6 +9250,7 @@
                 <w:sz w:val="22"/>
                 <w:szCs w:val="22"/>
               </w:rPr>
+              <w:lastRenderedPageBreak/>
               <w:t>დროს</w:t>
             </w:r>
             <w:r>
@@ -9093,6 +9408,7 @@
                 <w:sz w:val="22"/>
                 <w:szCs w:val="22"/>
               </w:rPr>
+              <w:lastRenderedPageBreak/>
               <w:t>✅</w:t>
             </w:r>
             <w:r>
@@ -9269,6 +9585,7 @@
                 <w:sz w:val="22"/>
                 <w:szCs w:val="22"/>
               </w:rPr>
+              <w:lastRenderedPageBreak/>
               <w:t>კომფორტული</w:t>
             </w:r>
             <w:r>
@@ -9580,6 +9897,7 @@
                 <w:sz w:val="22"/>
                 <w:szCs w:val="22"/>
               </w:rPr>
+              <w:lastRenderedPageBreak/>
               <w:t>„</w:t>
             </w:r>
             <w:r>
@@ -12826,7 +13144,6 @@
                 <w:sz w:val="22"/>
                 <w:szCs w:val="22"/>
               </w:rPr>
-              <w:lastRenderedPageBreak/>
               <w:t>„</w:t>
             </w:r>
             <w:r>
@@ -13854,6 +14171,7 @@
                 <w:sz w:val="22"/>
                 <w:szCs w:val="22"/>
               </w:rPr>
+              <w:lastRenderedPageBreak/>
               <w:t>„</w:t>
             </w:r>
             <w:r>

</xml_diff>

<commit_message>
fix(clinic): hide the meeting "Send email" header button on clinic visits
The user spotted what the reviewer most likely meant by "instead of Send
message there should be the booking action": the calendar.event form's
header carries a meeting-style "Send email" (action_open_composer) button
that makes no sense on a clinic booking and sat right where staff look for
the booking workflow. It is now hidden for is_clinic visits — the clinic
workflow buttons (Confirm/Arrived/Start/...) own that space; ordinary
meetings keep the button.

Co-Authored-By: Claude Fable 5 <noreply@anthropic.com>
</commit_message>
<xml_diff>
--- a/docs/28.08.26.docx
+++ b/docs/28.08.26.docx
@@ -1956,6 +1956,56 @@
           <w:szCs w:val="22"/>
           <w:lang w:val="ka-GE"/>
         </w:rPr>
+        <w:t xml:space="preserve">&gt;&gt; </w:t>
+      </w:r>
+      <w:r>
+        <w:rPr>
+          <w:noProof/>
+        </w:rPr>
+        <w:lastRenderedPageBreak/>
+        <w:drawing>
+          <wp:inline distT="0" distB="0" distL="0" distR="0" wp14:anchorId="1EAB8FEC" wp14:editId="4CE5846F">
+            <wp:extent cx="5727700" cy="3282315"/>
+            <wp:effectExtent l="0" t="0" r="6350" b="0"/>
+            <wp:docPr id="255749835" name="Picture 1" descr="The image displays a user interface with fields for personal information, contact details, and various settings.&#10;&#10;AI-generated content may be incorrect."/>
+            <wp:cNvGraphicFramePr>
+              <a:graphicFrameLocks xmlns:a="http://schemas.openxmlformats.org/drawingml/2006/main" noChangeAspect="1"/>
+            </wp:cNvGraphicFramePr>
+            <a:graphic xmlns:a="http://schemas.openxmlformats.org/drawingml/2006/main">
+              <a:graphicData uri="http://schemas.openxmlformats.org/drawingml/2006/picture">
+                <pic:pic xmlns:pic="http://schemas.openxmlformats.org/drawingml/2006/picture">
+                  <pic:nvPicPr>
+                    <pic:cNvPr id="255749835" name="Picture 1" descr="The image displays a user interface with fields for personal information, contact details, and various settings.&#10;&#10;AI-generated content may be incorrect."/>
+                    <pic:cNvPicPr/>
+                  </pic:nvPicPr>
+                  <pic:blipFill>
+                    <a:blip r:embed="rId22"/>
+                    <a:stretch>
+                      <a:fillRect/>
+                    </a:stretch>
+                  </pic:blipFill>
+                  <pic:spPr>
+                    <a:xfrm>
+                      <a:off x="0" y="0"/>
+                      <a:ext cx="5727700" cy="3282315"/>
+                    </a:xfrm>
+                    <a:prstGeom prst="rect">
+                      <a:avLst/>
+                    </a:prstGeom>
+                  </pic:spPr>
+                </pic:pic>
+              </a:graphicData>
+            </a:graphic>
+          </wp:inline>
+        </w:drawing>
+      </w:r>
+      <w:r>
+        <w:rPr>
+          <w:rFonts w:ascii="Helvetica" w:hAnsi="Helvetica"/>
+          <w:sz w:val="22"/>
+          <w:szCs w:val="22"/>
+          <w:lang w:val="ka-GE"/>
+        </w:rPr>
         <w:br/>
       </w:r>
       <w:r>
@@ -2099,13 +2149,73 @@
           <w:szCs w:val="22"/>
           <w:lang w:val="ka-GE"/>
         </w:rPr>
+        <w:t>&gt;&gt;&gt;</w:t>
+      </w:r>
+      <w:r>
+        <w:rPr>
+          <w:rFonts w:ascii="Helvetica" w:hAnsi="Helvetica"/>
+          <w:sz w:val="22"/>
+          <w:szCs w:val="22"/>
+          <w:lang w:val="ka-GE"/>
+        </w:rPr>
+        <w:drawing>
+          <wp:inline distT="0" distB="0" distL="0" distR="0" wp14:anchorId="2EC507FB" wp14:editId="6554E8B4">
+            <wp:extent cx="5727700" cy="2127250"/>
+            <wp:effectExtent l="0" t="0" r="6350" b="6350"/>
+            <wp:docPr id="729031691" name="Picture 1"/>
+            <wp:cNvGraphicFramePr>
+              <a:graphicFrameLocks xmlns:a="http://schemas.openxmlformats.org/drawingml/2006/main" noChangeAspect="1"/>
+            </wp:cNvGraphicFramePr>
+            <a:graphic xmlns:a="http://schemas.openxmlformats.org/drawingml/2006/main">
+              <a:graphicData uri="http://schemas.openxmlformats.org/drawingml/2006/picture">
+                <pic:pic xmlns:pic="http://schemas.openxmlformats.org/drawingml/2006/picture">
+                  <pic:nvPicPr>
+                    <pic:cNvPr id="729031691" name=""/>
+                    <pic:cNvPicPr/>
+                  </pic:nvPicPr>
+                  <pic:blipFill>
+                    <a:blip r:embed="rId23"/>
+                    <a:stretch>
+                      <a:fillRect/>
+                    </a:stretch>
+                  </pic:blipFill>
+                  <pic:spPr>
+                    <a:xfrm>
+                      <a:off x="0" y="0"/>
+                      <a:ext cx="5727700" cy="2127250"/>
+                    </a:xfrm>
+                    <a:prstGeom prst="rect">
+                      <a:avLst/>
+                    </a:prstGeom>
+                  </pic:spPr>
+                </pic:pic>
+              </a:graphicData>
+            </a:graphic>
+          </wp:inline>
+        </w:drawing>
+      </w:r>
+      <w:r>
+        <w:rPr>
+          <w:rFonts w:ascii="Helvetica" w:hAnsi="Helvetica"/>
+          <w:sz w:val="22"/>
+          <w:szCs w:val="22"/>
+          <w:lang w:val="ka-GE"/>
+        </w:rPr>
         <w:br/>
+      </w:r>
+      <w:r>
+        <w:rPr>
+          <w:rFonts w:ascii="Helvetica" w:hAnsi="Helvetica"/>
+          <w:sz w:val="22"/>
+          <w:szCs w:val="22"/>
+        </w:rPr>
+        <w:t xml:space="preserve"> </w:t>
       </w:r>
     </w:p>
     <w:p>
       <w:pPr>
         <w:rPr>
-          <w:rFonts w:ascii="Helvetica" w:hAnsi="Helvetica"/>
+          <w:rFonts w:ascii="Sylfaen" w:hAnsi="Sylfaen"/>
           <w:sz w:val="22"/>
           <w:szCs w:val="22"/>
           <w:lang w:val="ka-GE"/>
@@ -2138,7 +2248,35 @@
         </w:rPr>
         <w:t>დაჯავშნე“</w:t>
       </w:r>
+      <w:r>
+        <w:rPr>
+          <w:rFonts w:ascii="Helvetica" w:hAnsi="Helvetica"/>
+          <w:sz w:val="22"/>
+          <w:szCs w:val="22"/>
+          <w:lang w:val="ka-GE"/>
+        </w:rPr>
+        <w:t xml:space="preserve"> &gt;</w:t>
+      </w:r>
       <w:proofErr w:type="gramEnd"/>
+      <w:r>
+        <w:rPr>
+          <w:rFonts w:ascii="Helvetica" w:hAnsi="Helvetica"/>
+          <w:sz w:val="22"/>
+          <w:szCs w:val="22"/>
+          <w:lang w:val="ka-GE"/>
+        </w:rPr>
+        <w:t xml:space="preserve">&gt; </w:t>
+      </w:r>
+      <w:r>
+        <w:rPr>
+          <w:rFonts w:ascii="Sylfaen" w:hAnsi="Sylfaen"/>
+          <w:sz w:val="22"/>
+          <w:szCs w:val="22"/>
+          <w:highlight w:val="yellow"/>
+          <w:lang w:val="ka-GE"/>
+        </w:rPr>
+        <w:t>დავმალე საერთოდ. ზედმეტი იყოს. შენახვა ისედაც დაჯავშნა არის.</w:t>
+      </w:r>
     </w:p>
     <w:p>
       <w:pPr>
@@ -2249,7 +2387,6 @@
           <w:szCs w:val="22"/>
           <w:lang w:val="ka-GE"/>
         </w:rPr>
-        <w:lastRenderedPageBreak/>
         <w:br/>
         <w:t xml:space="preserve">ამ გვერდზე </w:t>
       </w:r>
@@ -2544,7 +2681,7 @@
                     <pic:cNvPicPr/>
                   </pic:nvPicPr>
                   <pic:blipFill>
-                    <a:blip r:embed="rId22">
+                    <a:blip r:embed="rId24">
                       <a:extLst>
                         <a:ext uri="{28A0092B-C50C-407E-A947-70E740481C1C}">
                           <a14:useLocalDpi xmlns:a14="http://schemas.microsoft.com/office/drawing/2010/main" val="0"/>
@@ -3036,7 +3173,6 @@
           <w:szCs w:val="22"/>
           <w:lang w:val="ka-GE"/>
         </w:rPr>
-        <w:lastRenderedPageBreak/>
         <w:t xml:space="preserve">2 კვირით ადრე პროგრამამ </w:t>
       </w:r>
       <w:r>
@@ -7490,7 +7626,6 @@
                 <w:sz w:val="22"/>
                 <w:szCs w:val="22"/>
               </w:rPr>
-              <w:lastRenderedPageBreak/>
               <w:t>📄</w:t>
             </w:r>
             <w:r>
@@ -7774,6 +7909,7 @@
                 <w:sz w:val="22"/>
                 <w:szCs w:val="22"/>
               </w:rPr>
+              <w:lastRenderedPageBreak/>
               <w:t>დანარჩენი</w:t>
             </w:r>
             <w:proofErr w:type="spellEnd"/>
@@ -7964,6 +8100,7 @@
                 <w:sz w:val="22"/>
                 <w:szCs w:val="22"/>
               </w:rPr>
+              <w:lastRenderedPageBreak/>
               <w:t>✅</w:t>
             </w:r>
             <w:r>
@@ -8287,6 +8424,7 @@
                 <w:sz w:val="22"/>
                 <w:szCs w:val="22"/>
               </w:rPr>
+              <w:lastRenderedPageBreak/>
               <w:t>არასამუშაო</w:t>
             </w:r>
             <w:proofErr w:type="spellEnd"/>
@@ -8567,6 +8705,7 @@
                 <w:sz w:val="22"/>
                 <w:szCs w:val="22"/>
               </w:rPr>
+              <w:lastRenderedPageBreak/>
               <w:t>„</w:t>
             </w:r>
             <w:proofErr w:type="spellStart"/>
@@ -13045,232 +13184,232 @@
                 <w:sz w:val="22"/>
                 <w:szCs w:val="22"/>
               </w:rPr>
+              <w:t>„</w:t>
+            </w:r>
+            <w:proofErr w:type="spellStart"/>
+            <w:r>
+              <w:rPr>
+                <w:rFonts w:ascii="Sylfaen" w:hAnsi="Sylfaen" w:cs="Sylfaen"/>
+                <w:sz w:val="22"/>
+                <w:szCs w:val="22"/>
+              </w:rPr>
+              <w:t>დაემატოს</w:t>
+            </w:r>
+            <w:proofErr w:type="spellEnd"/>
+            <w:r>
+              <w:rPr>
+                <w:rFonts w:ascii="Helvetica" w:hAnsi="Helvetica"/>
+                <w:sz w:val="22"/>
+                <w:szCs w:val="22"/>
+              </w:rPr>
+              <w:t xml:space="preserve"> </w:t>
+            </w:r>
+            <w:proofErr w:type="spellStart"/>
+            <w:r>
+              <w:rPr>
+                <w:rFonts w:ascii="Sylfaen" w:hAnsi="Sylfaen" w:cs="Sylfaen"/>
+                <w:sz w:val="22"/>
+                <w:szCs w:val="22"/>
+              </w:rPr>
+              <w:t>ღილაკი</w:t>
+            </w:r>
+            <w:proofErr w:type="spellEnd"/>
+            <w:r>
+              <w:rPr>
+                <w:rFonts w:ascii="Helvetica" w:hAnsi="Helvetica"/>
+                <w:sz w:val="22"/>
+                <w:szCs w:val="22"/>
+              </w:rPr>
+              <w:t xml:space="preserve"> </w:t>
+            </w:r>
+            <w:proofErr w:type="spellStart"/>
+            <w:r>
+              <w:rPr>
+                <w:rFonts w:ascii="Sylfaen" w:hAnsi="Sylfaen" w:cs="Sylfaen"/>
+                <w:sz w:val="22"/>
+                <w:szCs w:val="22"/>
+              </w:rPr>
+              <w:t>ვიზიტების</w:t>
+            </w:r>
+            <w:proofErr w:type="spellEnd"/>
+            <w:r>
+              <w:rPr>
+                <w:rFonts w:ascii="Helvetica" w:hAnsi="Helvetica"/>
+                <w:sz w:val="22"/>
+                <w:szCs w:val="22"/>
+              </w:rPr>
+              <w:t xml:space="preserve"> </w:t>
+            </w:r>
+            <w:proofErr w:type="spellStart"/>
+            <w:r>
+              <w:rPr>
+                <w:rFonts w:ascii="Sylfaen" w:hAnsi="Sylfaen" w:cs="Sylfaen"/>
+                <w:sz w:val="22"/>
+                <w:szCs w:val="22"/>
+              </w:rPr>
+              <w:t>ისტორია</w:t>
+            </w:r>
+            <w:proofErr w:type="spellEnd"/>
+            <w:r>
+              <w:rPr>
+                <w:rFonts w:ascii="Helvetica" w:hAnsi="Helvetica"/>
+                <w:sz w:val="22"/>
+                <w:szCs w:val="22"/>
+              </w:rPr>
+              <w:t xml:space="preserve"> (</w:t>
+            </w:r>
+            <w:proofErr w:type="spellStart"/>
+            <w:r>
+              <w:rPr>
+                <w:rFonts w:ascii="Sylfaen" w:hAnsi="Sylfaen" w:cs="Sylfaen"/>
+                <w:sz w:val="22"/>
+                <w:szCs w:val="22"/>
+              </w:rPr>
+              <w:t>თარიღი</w:t>
+            </w:r>
+            <w:proofErr w:type="spellEnd"/>
+            <w:r>
+              <w:rPr>
+                <w:rFonts w:ascii="Helvetica" w:hAnsi="Helvetica"/>
+                <w:sz w:val="22"/>
+                <w:szCs w:val="22"/>
+              </w:rPr>
+              <w:t xml:space="preserve">, </w:t>
+            </w:r>
+            <w:proofErr w:type="spellStart"/>
+            <w:r>
+              <w:rPr>
+                <w:rFonts w:ascii="Sylfaen" w:hAnsi="Sylfaen" w:cs="Sylfaen"/>
+                <w:sz w:val="22"/>
+                <w:szCs w:val="22"/>
+              </w:rPr>
+              <w:t>ექიმი</w:t>
+            </w:r>
+            <w:proofErr w:type="spellEnd"/>
+            <w:r>
+              <w:rPr>
+                <w:rFonts w:ascii="Helvetica" w:hAnsi="Helvetica"/>
+                <w:sz w:val="22"/>
+                <w:szCs w:val="22"/>
+              </w:rPr>
+              <w:t xml:space="preserve">, </w:t>
+            </w:r>
+            <w:proofErr w:type="spellStart"/>
+            <w:r>
+              <w:rPr>
+                <w:rFonts w:ascii="Sylfaen" w:hAnsi="Sylfaen" w:cs="Sylfaen"/>
+                <w:sz w:val="22"/>
+                <w:szCs w:val="22"/>
+              </w:rPr>
+              <w:t>მანიპულაცია</w:t>
+            </w:r>
+            <w:proofErr w:type="spellEnd"/>
+            <w:r>
+              <w:rPr>
+                <w:rFonts w:ascii="Helvetica" w:hAnsi="Helvetica"/>
+                <w:sz w:val="22"/>
+                <w:szCs w:val="22"/>
+              </w:rPr>
+              <w:t xml:space="preserve">, </w:t>
+            </w:r>
+            <w:proofErr w:type="spellStart"/>
+            <w:r>
+              <w:rPr>
+                <w:rFonts w:ascii="Sylfaen" w:hAnsi="Sylfaen" w:cs="Sylfaen"/>
+                <w:sz w:val="22"/>
+                <w:szCs w:val="22"/>
+              </w:rPr>
+              <w:t>დიაგნოზი</w:t>
+            </w:r>
+            <w:proofErr w:type="spellEnd"/>
+            <w:r>
+              <w:rPr>
+                <w:rFonts w:ascii="Helvetica" w:hAnsi="Helvetica"/>
+                <w:sz w:val="22"/>
+                <w:szCs w:val="22"/>
+              </w:rPr>
+              <w:t xml:space="preserve">, </w:t>
+            </w:r>
+            <w:proofErr w:type="spellStart"/>
+            <w:r>
+              <w:rPr>
+                <w:rFonts w:ascii="Sylfaen" w:hAnsi="Sylfaen" w:cs="Sylfaen"/>
+                <w:sz w:val="22"/>
+                <w:szCs w:val="22"/>
+              </w:rPr>
+              <w:t>კბილის</w:t>
+            </w:r>
+            <w:proofErr w:type="spellEnd"/>
+            <w:r>
+              <w:rPr>
+                <w:rFonts w:ascii="Helvetica" w:hAnsi="Helvetica"/>
+                <w:sz w:val="22"/>
+                <w:szCs w:val="22"/>
+              </w:rPr>
+              <w:t xml:space="preserve"> </w:t>
+            </w:r>
+            <w:proofErr w:type="spellStart"/>
+            <w:r>
+              <w:rPr>
+                <w:rFonts w:ascii="Sylfaen" w:hAnsi="Sylfaen" w:cs="Sylfaen"/>
+                <w:sz w:val="22"/>
+                <w:szCs w:val="22"/>
+              </w:rPr>
+              <w:t>ნომერი</w:t>
+            </w:r>
+            <w:proofErr w:type="spellEnd"/>
+            <w:r>
+              <w:rPr>
+                <w:rFonts w:ascii="Helvetica" w:hAnsi="Helvetica"/>
+                <w:sz w:val="22"/>
+                <w:szCs w:val="22"/>
+              </w:rPr>
+              <w:t xml:space="preserve">, </w:t>
+            </w:r>
+            <w:proofErr w:type="spellStart"/>
+            <w:r>
+              <w:rPr>
+                <w:rFonts w:ascii="Sylfaen" w:hAnsi="Sylfaen" w:cs="Sylfaen"/>
+                <w:sz w:val="22"/>
+                <w:szCs w:val="22"/>
+              </w:rPr>
+              <w:t>შესრულება</w:t>
+            </w:r>
+            <w:proofErr w:type="spellEnd"/>
+            <w:r>
+              <w:rPr>
+                <w:rFonts w:ascii="Helvetica" w:hAnsi="Helvetica"/>
+                <w:sz w:val="22"/>
+                <w:szCs w:val="22"/>
+              </w:rPr>
+              <w:t xml:space="preserve">, </w:t>
+            </w:r>
+            <w:proofErr w:type="spellStart"/>
+            <w:r>
+              <w:rPr>
+                <w:rFonts w:ascii="Sylfaen" w:hAnsi="Sylfaen" w:cs="Sylfaen"/>
+                <w:sz w:val="22"/>
+                <w:szCs w:val="22"/>
+              </w:rPr>
+              <w:t>გადახდილი</w:t>
+            </w:r>
+            <w:proofErr w:type="spellEnd"/>
+            <w:r>
+              <w:rPr>
+                <w:rFonts w:ascii="Helvetica" w:hAnsi="Helvetica"/>
+                <w:sz w:val="22"/>
+                <w:szCs w:val="22"/>
+              </w:rPr>
+              <w:t xml:space="preserve"> </w:t>
+            </w:r>
+            <w:proofErr w:type="spellStart"/>
+            <w:r>
+              <w:rPr>
+                <w:rFonts w:ascii="Sylfaen" w:hAnsi="Sylfaen" w:cs="Sylfaen"/>
+                <w:sz w:val="22"/>
+                <w:szCs w:val="22"/>
+              </w:rPr>
               <w:lastRenderedPageBreak/>
-              <w:t>„</w:t>
-            </w:r>
-            <w:proofErr w:type="spellStart"/>
-            <w:r>
-              <w:rPr>
-                <w:rFonts w:ascii="Sylfaen" w:hAnsi="Sylfaen" w:cs="Sylfaen"/>
-                <w:sz w:val="22"/>
-                <w:szCs w:val="22"/>
-              </w:rPr>
-              <w:t>დაემატოს</w:t>
-            </w:r>
-            <w:proofErr w:type="spellEnd"/>
-            <w:r>
-              <w:rPr>
-                <w:rFonts w:ascii="Helvetica" w:hAnsi="Helvetica"/>
-                <w:sz w:val="22"/>
-                <w:szCs w:val="22"/>
-              </w:rPr>
-              <w:t xml:space="preserve"> </w:t>
-            </w:r>
-            <w:proofErr w:type="spellStart"/>
-            <w:r>
-              <w:rPr>
-                <w:rFonts w:ascii="Sylfaen" w:hAnsi="Sylfaen" w:cs="Sylfaen"/>
-                <w:sz w:val="22"/>
-                <w:szCs w:val="22"/>
-              </w:rPr>
-              <w:t>ღილაკი</w:t>
-            </w:r>
-            <w:proofErr w:type="spellEnd"/>
-            <w:r>
-              <w:rPr>
-                <w:rFonts w:ascii="Helvetica" w:hAnsi="Helvetica"/>
-                <w:sz w:val="22"/>
-                <w:szCs w:val="22"/>
-              </w:rPr>
-              <w:t xml:space="preserve"> </w:t>
-            </w:r>
-            <w:proofErr w:type="spellStart"/>
-            <w:r>
-              <w:rPr>
-                <w:rFonts w:ascii="Sylfaen" w:hAnsi="Sylfaen" w:cs="Sylfaen"/>
-                <w:sz w:val="22"/>
-                <w:szCs w:val="22"/>
-              </w:rPr>
-              <w:t>ვიზიტების</w:t>
-            </w:r>
-            <w:proofErr w:type="spellEnd"/>
-            <w:r>
-              <w:rPr>
-                <w:rFonts w:ascii="Helvetica" w:hAnsi="Helvetica"/>
-                <w:sz w:val="22"/>
-                <w:szCs w:val="22"/>
-              </w:rPr>
-              <w:t xml:space="preserve"> </w:t>
-            </w:r>
-            <w:proofErr w:type="spellStart"/>
-            <w:r>
-              <w:rPr>
-                <w:rFonts w:ascii="Sylfaen" w:hAnsi="Sylfaen" w:cs="Sylfaen"/>
-                <w:sz w:val="22"/>
-                <w:szCs w:val="22"/>
-              </w:rPr>
-              <w:t>ისტორია</w:t>
-            </w:r>
-            <w:proofErr w:type="spellEnd"/>
-            <w:r>
-              <w:rPr>
-                <w:rFonts w:ascii="Helvetica" w:hAnsi="Helvetica"/>
-                <w:sz w:val="22"/>
-                <w:szCs w:val="22"/>
-              </w:rPr>
-              <w:t xml:space="preserve"> (</w:t>
-            </w:r>
-            <w:proofErr w:type="spellStart"/>
-            <w:r>
-              <w:rPr>
-                <w:rFonts w:ascii="Sylfaen" w:hAnsi="Sylfaen" w:cs="Sylfaen"/>
-                <w:sz w:val="22"/>
-                <w:szCs w:val="22"/>
-              </w:rPr>
-              <w:t>თარიღი</w:t>
-            </w:r>
-            <w:proofErr w:type="spellEnd"/>
-            <w:r>
-              <w:rPr>
-                <w:rFonts w:ascii="Helvetica" w:hAnsi="Helvetica"/>
-                <w:sz w:val="22"/>
-                <w:szCs w:val="22"/>
-              </w:rPr>
-              <w:t xml:space="preserve">, </w:t>
-            </w:r>
-            <w:proofErr w:type="spellStart"/>
-            <w:r>
-              <w:rPr>
-                <w:rFonts w:ascii="Sylfaen" w:hAnsi="Sylfaen" w:cs="Sylfaen"/>
-                <w:sz w:val="22"/>
-                <w:szCs w:val="22"/>
-              </w:rPr>
-              <w:t>ექიმი</w:t>
-            </w:r>
-            <w:proofErr w:type="spellEnd"/>
-            <w:r>
-              <w:rPr>
-                <w:rFonts w:ascii="Helvetica" w:hAnsi="Helvetica"/>
-                <w:sz w:val="22"/>
-                <w:szCs w:val="22"/>
-              </w:rPr>
-              <w:t xml:space="preserve">, </w:t>
-            </w:r>
-            <w:proofErr w:type="spellStart"/>
-            <w:r>
-              <w:rPr>
-                <w:rFonts w:ascii="Sylfaen" w:hAnsi="Sylfaen" w:cs="Sylfaen"/>
-                <w:sz w:val="22"/>
-                <w:szCs w:val="22"/>
-              </w:rPr>
-              <w:t>მანიპულაცია</w:t>
-            </w:r>
-            <w:proofErr w:type="spellEnd"/>
-            <w:r>
-              <w:rPr>
-                <w:rFonts w:ascii="Helvetica" w:hAnsi="Helvetica"/>
-                <w:sz w:val="22"/>
-                <w:szCs w:val="22"/>
-              </w:rPr>
-              <w:t xml:space="preserve">, </w:t>
-            </w:r>
-            <w:proofErr w:type="spellStart"/>
-            <w:r>
-              <w:rPr>
-                <w:rFonts w:ascii="Sylfaen" w:hAnsi="Sylfaen" w:cs="Sylfaen"/>
-                <w:sz w:val="22"/>
-                <w:szCs w:val="22"/>
-              </w:rPr>
-              <w:t>დიაგნოზი</w:t>
-            </w:r>
-            <w:proofErr w:type="spellEnd"/>
-            <w:r>
-              <w:rPr>
-                <w:rFonts w:ascii="Helvetica" w:hAnsi="Helvetica"/>
-                <w:sz w:val="22"/>
-                <w:szCs w:val="22"/>
-              </w:rPr>
-              <w:t xml:space="preserve">, </w:t>
-            </w:r>
-            <w:proofErr w:type="spellStart"/>
-            <w:r>
-              <w:rPr>
-                <w:rFonts w:ascii="Sylfaen" w:hAnsi="Sylfaen" w:cs="Sylfaen"/>
-                <w:sz w:val="22"/>
-                <w:szCs w:val="22"/>
-              </w:rPr>
-              <w:t>კბილის</w:t>
-            </w:r>
-            <w:proofErr w:type="spellEnd"/>
-            <w:r>
-              <w:rPr>
-                <w:rFonts w:ascii="Helvetica" w:hAnsi="Helvetica"/>
-                <w:sz w:val="22"/>
-                <w:szCs w:val="22"/>
-              </w:rPr>
-              <w:t xml:space="preserve"> </w:t>
-            </w:r>
-            <w:proofErr w:type="spellStart"/>
-            <w:r>
-              <w:rPr>
-                <w:rFonts w:ascii="Sylfaen" w:hAnsi="Sylfaen" w:cs="Sylfaen"/>
-                <w:sz w:val="22"/>
-                <w:szCs w:val="22"/>
-              </w:rPr>
-              <w:t>ნომერი</w:t>
-            </w:r>
-            <w:proofErr w:type="spellEnd"/>
-            <w:r>
-              <w:rPr>
-                <w:rFonts w:ascii="Helvetica" w:hAnsi="Helvetica"/>
-                <w:sz w:val="22"/>
-                <w:szCs w:val="22"/>
-              </w:rPr>
-              <w:t xml:space="preserve">, </w:t>
-            </w:r>
-            <w:proofErr w:type="spellStart"/>
-            <w:r>
-              <w:rPr>
-                <w:rFonts w:ascii="Sylfaen" w:hAnsi="Sylfaen" w:cs="Sylfaen"/>
-                <w:sz w:val="22"/>
-                <w:szCs w:val="22"/>
-              </w:rPr>
-              <w:t>შესრულება</w:t>
-            </w:r>
-            <w:proofErr w:type="spellEnd"/>
-            <w:r>
-              <w:rPr>
-                <w:rFonts w:ascii="Helvetica" w:hAnsi="Helvetica"/>
-                <w:sz w:val="22"/>
-                <w:szCs w:val="22"/>
-              </w:rPr>
-              <w:t xml:space="preserve">, </w:t>
-            </w:r>
-            <w:proofErr w:type="spellStart"/>
-            <w:r>
-              <w:rPr>
-                <w:rFonts w:ascii="Sylfaen" w:hAnsi="Sylfaen" w:cs="Sylfaen"/>
-                <w:sz w:val="22"/>
-                <w:szCs w:val="22"/>
-              </w:rPr>
-              <w:t>გადახდილი</w:t>
-            </w:r>
-            <w:proofErr w:type="spellEnd"/>
-            <w:r>
-              <w:rPr>
-                <w:rFonts w:ascii="Helvetica" w:hAnsi="Helvetica"/>
-                <w:sz w:val="22"/>
-                <w:szCs w:val="22"/>
-              </w:rPr>
-              <w:t xml:space="preserve"> </w:t>
-            </w:r>
-            <w:proofErr w:type="spellStart"/>
-            <w:r>
-              <w:rPr>
-                <w:rFonts w:ascii="Sylfaen" w:hAnsi="Sylfaen" w:cs="Sylfaen"/>
-                <w:sz w:val="22"/>
-                <w:szCs w:val="22"/>
-              </w:rPr>
               <w:t>თანხა</w:t>
             </w:r>
             <w:proofErr w:type="spellEnd"/>
@@ -13461,6 +13600,7 @@
                 <w:sz w:val="22"/>
                 <w:szCs w:val="22"/>
               </w:rPr>
+              <w:lastRenderedPageBreak/>
               <w:t>✅</w:t>
             </w:r>
             <w:r>
@@ -13827,7 +13967,16 @@
                 <w:sz w:val="22"/>
                 <w:szCs w:val="22"/>
               </w:rPr>
-              <w:t xml:space="preserve"> (</w:t>
+              <w:t xml:space="preserve"> </w:t>
+            </w:r>
+            <w:r>
+              <w:rPr>
+                <w:rFonts w:ascii="Helvetica" w:hAnsi="Helvetica"/>
+                <w:sz w:val="22"/>
+                <w:szCs w:val="22"/>
+              </w:rPr>
+              <w:lastRenderedPageBreak/>
+              <w:t>(</w:t>
             </w:r>
             <w:proofErr w:type="spellStart"/>
             <w:r>
@@ -14142,6 +14291,7 @@
                 <w:sz w:val="22"/>
                 <w:szCs w:val="22"/>
               </w:rPr>
+              <w:lastRenderedPageBreak/>
               <w:t>„</w:t>
             </w:r>
             <w:proofErr w:type="spellStart"/>
@@ -18183,7 +18333,6 @@
                 <w:sz w:val="22"/>
                 <w:szCs w:val="22"/>
               </w:rPr>
-              <w:lastRenderedPageBreak/>
               <w:t>ხმით</w:t>
             </w:r>
             <w:proofErr w:type="spellEnd"/>
@@ -18340,7 +18489,6 @@
                 <w:sz w:val="22"/>
                 <w:szCs w:val="22"/>
               </w:rPr>
-              <w:lastRenderedPageBreak/>
               <w:t>„</w:t>
             </w:r>
             <w:proofErr w:type="spellStart"/>
@@ -18617,6 +18765,7 @@
                 <w:sz w:val="22"/>
                 <w:szCs w:val="22"/>
               </w:rPr>
+              <w:lastRenderedPageBreak/>
               <w:t>მიხედვით</w:t>
             </w:r>
             <w:proofErr w:type="spellEnd"/>
@@ -18771,6 +18920,7 @@
                 <w:sz w:val="22"/>
                 <w:szCs w:val="22"/>
               </w:rPr>
+              <w:lastRenderedPageBreak/>
               <w:t>„</w:t>
             </w:r>
             <w:proofErr w:type="spellStart"/>

</xml_diff>

<commit_message>
feat(clinic): patient "რეალიზაცია" tab replaces Sales & Purchase
User follow-up on the reviewer's "what is Sales & Purchase for — selling
toothbrushes?": for patients the standard meeting-style tab (salesperson /
fiscal / vendor fields / stray website in Misc) is now hidden entirely and
replaced by a clean "რეალიზაცია" page:
- "🪥 ახალი გაყიდვა" button opens a new sale.order pre-set to the patient —
  retail sales (toothbrushes, pastes) start in one click;
- sale defaults (salesperson, payment terms) kept as two simple fields;
- read-only Sales History list (order, date, total, state badge) right on the
  patient card.
Vendors/companies keep the standard Sales & Purchase tab unchanged.

Verified live: base tab invisible for patients, new page + button in the
combined arch, action returns sale.order with default_partner_id.

Co-Authored-By: Claude Fable 5 <noreply@anthropic.com>
</commit_message>
<xml_diff>
--- a/docs/28.08.26.docx
+++ b/docs/28.08.26.docx
@@ -2236,16 +2236,36 @@
           <w:szCs w:val="22"/>
           <w:lang w:val="ka-GE"/>
         </w:rPr>
-        <w:t>ნაცვლად იყოს „დაჯავშნე“</w:t>
-      </w:r>
-      <w:r>
-        <w:rPr>
-          <w:rFonts w:ascii="Helvetica" w:hAnsi="Helvetica"/>
-          <w:sz w:val="22"/>
-          <w:szCs w:val="22"/>
-          <w:lang w:val="ka-GE"/>
-        </w:rPr>
-        <w:t xml:space="preserve"> &gt;&gt; </w:t>
+        <w:t>ნაცვლად იყოს „</w:t>
+      </w:r>
+      <w:proofErr w:type="gramStart"/>
+      <w:r>
+        <w:rPr>
+          <w:rFonts w:ascii="Helvetica" w:hAnsi="Helvetica"/>
+          <w:sz w:val="22"/>
+          <w:szCs w:val="22"/>
+          <w:lang w:val="ka-GE"/>
+        </w:rPr>
+        <w:t>დაჯავშნე“</w:t>
+      </w:r>
+      <w:r>
+        <w:rPr>
+          <w:rFonts w:ascii="Helvetica" w:hAnsi="Helvetica"/>
+          <w:sz w:val="22"/>
+          <w:szCs w:val="22"/>
+          <w:lang w:val="ka-GE"/>
+        </w:rPr>
+        <w:t xml:space="preserve"> &gt;</w:t>
+      </w:r>
+      <w:proofErr w:type="gramEnd"/>
+      <w:r>
+        <w:rPr>
+          <w:rFonts w:ascii="Helvetica" w:hAnsi="Helvetica"/>
+          <w:sz w:val="22"/>
+          <w:szCs w:val="22"/>
+          <w:lang w:val="ka-GE"/>
+        </w:rPr>
+        <w:t xml:space="preserve">&gt; </w:t>
       </w:r>
       <w:r>
         <w:rPr>
@@ -2413,11 +2433,78 @@
         </w:rPr>
         <w:t xml:space="preserve"> - ექიმის მიხედვთ</w:t>
       </w:r>
+      <w:r>
+        <w:rPr>
+          <w:rFonts w:ascii="Helvetica" w:hAnsi="Helvetica"/>
+          <w:sz w:val="22"/>
+          <w:szCs w:val="22"/>
+          <w:lang w:val="ka-GE"/>
+        </w:rPr>
+        <w:t xml:space="preserve"> &gt;&gt;&gt;</w:t>
+      </w:r>
+      <w:r>
+        <w:rPr>
+          <w:noProof/>
+        </w:rPr>
+        <w:drawing>
+          <wp:inline distT="0" distB="0" distL="0" distR="0" wp14:anchorId="481CBC68" wp14:editId="0DB7246E">
+            <wp:extent cx="5727700" cy="2693035"/>
+            <wp:effectExtent l="0" t="0" r="6350" b="0"/>
+            <wp:docPr id="1022264430" name="Picture 1" descr="The image displays a user interface with a reservation or waitlist form for dental services, showing dates, doctor names, and options to add or remove entries.&#10;&#10;AI-generated content may be incorrect."/>
+            <wp:cNvGraphicFramePr>
+              <a:graphicFrameLocks xmlns:a="http://schemas.openxmlformats.org/drawingml/2006/main" noChangeAspect="1"/>
+            </wp:cNvGraphicFramePr>
+            <a:graphic xmlns:a="http://schemas.openxmlformats.org/drawingml/2006/main">
+              <a:graphicData uri="http://schemas.openxmlformats.org/drawingml/2006/picture">
+                <pic:pic xmlns:pic="http://schemas.openxmlformats.org/drawingml/2006/picture">
+                  <pic:nvPicPr>
+                    <pic:cNvPr id="1022264430" name="Picture 1" descr="The image displays a user interface with a reservation or waitlist form for dental services, showing dates, doctor names, and options to add or remove entries.&#10;&#10;AI-generated content may be incorrect."/>
+                    <pic:cNvPicPr/>
+                  </pic:nvPicPr>
+                  <pic:blipFill>
+                    <a:blip r:embed="rId25"/>
+                    <a:stretch>
+                      <a:fillRect/>
+                    </a:stretch>
+                  </pic:blipFill>
+                  <pic:spPr>
+                    <a:xfrm>
+                      <a:off x="0" y="0"/>
+                      <a:ext cx="5727700" cy="2693035"/>
+                    </a:xfrm>
+                    <a:prstGeom prst="rect">
+                      <a:avLst/>
+                    </a:prstGeom>
+                  </pic:spPr>
+                </pic:pic>
+              </a:graphicData>
+            </a:graphic>
+          </wp:inline>
+        </w:drawing>
+      </w:r>
+      <w:r>
+        <w:rPr>
+          <w:rFonts w:ascii="Helvetica" w:hAnsi="Helvetica"/>
+          <w:sz w:val="22"/>
+          <w:szCs w:val="22"/>
+          <w:lang w:val="ka-GE"/>
+        </w:rPr>
+        <w:br/>
+      </w:r>
+      <w:r>
+        <w:rPr>
+          <w:rFonts w:ascii="Helvetica" w:hAnsi="Helvetica"/>
+          <w:sz w:val="22"/>
+          <w:szCs w:val="22"/>
+          <w:lang w:val="ka-GE"/>
+        </w:rPr>
+        <w:br/>
+      </w:r>
     </w:p>
     <w:p>
       <w:pPr>
         <w:rPr>
-          <w:rFonts w:ascii="Helvetica" w:hAnsi="Helvetica"/>
+          <w:rFonts w:ascii="Sylfaen" w:hAnsi="Sylfaen"/>
           <w:sz w:val="22"/>
           <w:szCs w:val="22"/>
           <w:lang w:val="ka-GE"/>
@@ -2469,6 +2556,54 @@
           <w:lang w:val="ka-GE"/>
         </w:rPr>
         <w:t>?</w:t>
+      </w:r>
+      <w:r>
+        <w:rPr>
+          <w:rFonts w:ascii="Helvetica" w:hAnsi="Helvetica"/>
+          <w:sz w:val="22"/>
+          <w:szCs w:val="22"/>
+          <w:lang w:val="ka-GE"/>
+        </w:rPr>
+        <w:t xml:space="preserve"> </w:t>
+      </w:r>
+      <w:r>
+        <w:rPr>
+          <w:rFonts w:ascii="Helvetica" w:hAnsi="Helvetica"/>
+          <w:sz w:val="22"/>
+          <w:szCs w:val="22"/>
+          <w:highlight w:val="yellow"/>
+          <w:lang w:val="ka-GE"/>
+        </w:rPr>
+        <w:t xml:space="preserve">&gt;&gt;&gt; </w:t>
+      </w:r>
+      <w:r>
+        <w:rPr>
+          <w:rFonts w:ascii="Sylfaen" w:hAnsi="Sylfaen"/>
+          <w:sz w:val="22"/>
+          <w:szCs w:val="22"/>
+          <w:highlight w:val="yellow"/>
+          <w:lang w:val="ka-GE"/>
+        </w:rPr>
+        <w:t>ეხლა ტაბს ქვია რეალიზაცია სადაც ქმნი ორდერს გაყიდვებზე. (ჯაგრისი და ეგეთები)</w:t>
+      </w:r>
+    </w:p>
+    <w:p>
+      <w:pPr>
+        <w:rPr>
+          <w:rFonts w:ascii="Helvetica" w:hAnsi="Helvetica"/>
+          <w:sz w:val="22"/>
+          <w:szCs w:val="22"/>
+          <w:lang w:val="ka-GE"/>
+        </w:rPr>
+      </w:pPr>
+      <w:r>
+        <w:rPr>
+          <w:rFonts w:ascii="Helvetica" w:hAnsi="Helvetica"/>
+          <w:sz w:val="22"/>
+          <w:szCs w:val="22"/>
+          <w:lang w:val="ka-GE"/>
+        </w:rPr>
+        <w:t xml:space="preserve"> </w:t>
       </w:r>
     </w:p>
     <w:p>
@@ -2485,17 +2620,47 @@
       <w:pPr>
         <w:rPr>
           <w:rFonts w:ascii="Helvetica" w:hAnsi="Helvetica"/>
+          <w:b/>
           <w:sz w:val="22"/>
           <w:szCs w:val="22"/>
           <w:lang w:val="ka-GE"/>
         </w:rPr>
       </w:pPr>
+      <w:r>
+        <w:rPr>
+          <w:rFonts w:ascii="Helvetica" w:hAnsi="Helvetica"/>
+          <w:b/>
+          <w:sz w:val="22"/>
+          <w:szCs w:val="22"/>
+          <w:lang w:val="ka-GE"/>
+        </w:rPr>
+        <w:br/>
+      </w:r>
+      <w:r>
+        <w:rPr>
+          <w:rFonts w:ascii="Helvetica" w:hAnsi="Helvetica"/>
+          <w:b/>
+          <w:sz w:val="22"/>
+          <w:szCs w:val="22"/>
+          <w:lang w:val="ka-GE"/>
+        </w:rPr>
+        <w:t>ვიზიტი</w:t>
+      </w:r>
+      <w:r>
+        <w:rPr>
+          <w:rFonts w:ascii="Helvetica" w:hAnsi="Helvetica"/>
+          <w:b/>
+          <w:sz w:val="22"/>
+          <w:szCs w:val="22"/>
+          <w:lang w:val="ka-GE"/>
+        </w:rPr>
+        <w:br/>
+      </w:r>
     </w:p>
     <w:p>
       <w:pPr>
         <w:rPr>
           <w:rFonts w:ascii="Helvetica" w:hAnsi="Helvetica"/>
-          <w:b/>
           <w:sz w:val="22"/>
           <w:szCs w:val="22"/>
           <w:lang w:val="ka-GE"/>
@@ -2504,46 +2669,6 @@
       <w:r>
         <w:rPr>
           <w:rFonts w:ascii="Helvetica" w:hAnsi="Helvetica"/>
-          <w:b/>
-          <w:sz w:val="22"/>
-          <w:szCs w:val="22"/>
-          <w:lang w:val="ka-GE"/>
-        </w:rPr>
-        <w:br/>
-      </w:r>
-      <w:r>
-        <w:rPr>
-          <w:rFonts w:ascii="Helvetica" w:hAnsi="Helvetica"/>
-          <w:b/>
-          <w:sz w:val="22"/>
-          <w:szCs w:val="22"/>
-          <w:lang w:val="ka-GE"/>
-        </w:rPr>
-        <w:t>ვიზიტი</w:t>
-      </w:r>
-      <w:r>
-        <w:rPr>
-          <w:rFonts w:ascii="Helvetica" w:hAnsi="Helvetica"/>
-          <w:b/>
-          <w:sz w:val="22"/>
-          <w:szCs w:val="22"/>
-          <w:lang w:val="ka-GE"/>
-        </w:rPr>
-        <w:br/>
-      </w:r>
-    </w:p>
-    <w:p>
-      <w:pPr>
-        <w:rPr>
-          <w:rFonts w:ascii="Helvetica" w:hAnsi="Helvetica"/>
-          <w:sz w:val="22"/>
-          <w:szCs w:val="22"/>
-          <w:lang w:val="ka-GE"/>
-        </w:rPr>
-      </w:pPr>
-      <w:r>
-        <w:rPr>
-          <w:rFonts w:ascii="Helvetica" w:hAnsi="Helvetica"/>
           <w:sz w:val="22"/>
           <w:szCs w:val="22"/>
           <w:lang w:val="ka-GE"/>
@@ -2647,7 +2772,17 @@
           <w:szCs w:val="22"/>
           <w:lang w:val="ka-GE"/>
         </w:rPr>
-        <w:t>არ შეიძლებოდეს პაციენტის ხელახალი რეგისტრაცია</w:t>
+        <w:t xml:space="preserve">არ შეიძლებოდეს პაციენტის ხელახალი </w:t>
+      </w:r>
+      <w:r>
+        <w:rPr>
+          <w:rFonts w:ascii="Helvetica" w:hAnsi="Helvetica"/>
+          <w:sz w:val="22"/>
+          <w:szCs w:val="22"/>
+          <w:lang w:val="ka-GE"/>
+        </w:rPr>
+        <w:lastRenderedPageBreak/>
+        <w:t>რეგისტრაცია</w:t>
       </w:r>
       <w:r>
         <w:rPr>
@@ -2724,7 +2859,7 @@
                     <pic:cNvPicPr/>
                   </pic:nvPicPr>
                   <pic:blipFill>
-                    <a:blip r:embed="rId25">
+                    <a:blip r:embed="rId26">
                       <a:extLst>
                         <a:ext uri="{28A0092B-C50C-407E-A947-70E740481C1C}">
                           <a14:useLocalDpi xmlns:a14="http://schemas.microsoft.com/office/drawing/2010/main" val="0"/>
@@ -2853,7 +2988,6 @@
           <w:szCs w:val="22"/>
           <w:lang w:val="ka-GE"/>
         </w:rPr>
-        <w:lastRenderedPageBreak/>
         <w:t xml:space="preserve">ისრების ნაცვლად მოქნილი ღილაკები გვჭირდება (მაგ. პაციენტის ანკეტაზე გადასასვლელად) </w:t>
       </w:r>
     </w:p>
@@ -2909,10 +3043,10 @@
           <w:noProof/>
         </w:rPr>
         <w:drawing>
-          <wp:inline distT="0" distB="0" distL="0" distR="0" wp14:anchorId="2F26091C" wp14:editId="23923CD0">
+          <wp:inline distT="0" distB="0" distL="0" distR="0" wp14:anchorId="2F26091C" wp14:editId="6FB89511">
             <wp:extent cx="5727700" cy="2909570"/>
             <wp:effectExtent l="0" t="0" r="6350" b="5080"/>
-            <wp:docPr id="1954035332" name="Picture 1"/>
+            <wp:docPr id="1954035332" name="Picture 1" descr="The image displays a user interface for an Odoo meeting, showing a scheduled appointment for Dr. Alex Morgan in Room 1, with a duration of 10 minutes, and includes options to view notes, diagnosis, and manage attendees.&#10;&#10;AI-generated content may be incorrect."/>
             <wp:cNvGraphicFramePr>
               <a:graphicFrameLocks xmlns:a="http://schemas.openxmlformats.org/drawingml/2006/main" noChangeAspect="1"/>
             </wp:cNvGraphicFramePr>
@@ -2920,11 +3054,11 @@
               <a:graphicData uri="http://schemas.openxmlformats.org/drawingml/2006/picture">
                 <pic:pic xmlns:pic="http://schemas.openxmlformats.org/drawingml/2006/picture">
                   <pic:nvPicPr>
-                    <pic:cNvPr id="1954035332" name=""/>
+                    <pic:cNvPr id="1954035332" name="Picture 1" descr="The image displays a user interface for an Odoo meeting, showing a scheduled appointment for Dr. Alex Morgan in Room 1, with a duration of 10 minutes, and includes options to view notes, diagnosis, and manage attendees.&#10;&#10;AI-generated content may be incorrect."/>
                     <pic:cNvPicPr/>
                   </pic:nvPicPr>
                   <pic:blipFill>
-                    <a:blip r:embed="rId26"/>
+                    <a:blip r:embed="rId27"/>
                     <a:stretch>
                       <a:fillRect/>
                     </a:stretch>
@@ -3088,6 +3222,46 @@
           <w:lang w:val="ka-GE"/>
         </w:rPr>
         <w:t>მეილის გაგზავნა - რა იგზავნება, რა დროს?</w:t>
+      </w:r>
+      <w:r>
+        <w:rPr>
+          <w:rFonts w:ascii="Helvetica" w:hAnsi="Helvetica"/>
+          <w:sz w:val="22"/>
+          <w:szCs w:val="22"/>
+          <w:lang w:val="ka-GE"/>
+        </w:rPr>
+        <w:t xml:space="preserve"> </w:t>
+      </w:r>
+      <w:r>
+        <w:rPr>
+          <w:rFonts w:ascii="Helvetica" w:hAnsi="Helvetica"/>
+          <w:sz w:val="22"/>
+          <w:szCs w:val="22"/>
+          <w:highlight w:val="yellow"/>
+          <w:lang w:val="ka-GE"/>
+        </w:rPr>
+        <w:t xml:space="preserve">&gt;&gt; </w:t>
+      </w:r>
+      <w:r>
+        <w:rPr>
+          <w:rFonts w:ascii="Sylfaen" w:hAnsi="Sylfaen"/>
+          <w:sz w:val="22"/>
+          <w:szCs w:val="22"/>
+          <w:highlight w:val="yellow"/>
+          <w:lang w:val="ka-GE"/>
+        </w:rPr>
+        <w:t xml:space="preserve">ეხლა არაფერი არ იგზავნება. </w:t>
+      </w:r>
+      <w:r>
+        <w:rPr>
+          <w:rFonts w:ascii="Sylfaen" w:hAnsi="Sylfaen"/>
+          <w:sz w:val="22"/>
+          <w:szCs w:val="22"/>
+          <w:highlight w:val="yellow"/>
+          <w:lang w:val="ka-GE"/>
+        </w:rPr>
+        <w:lastRenderedPageBreak/>
+        <w:t>ფუქნციურად დევს და რასაც ვიტყვით გავაგზავნით</w:t>
       </w:r>
       <w:r>
         <w:rPr>

</xml_diff>

<commit_message>
fix(clinic): hide the RSVP "Going?" badge and Busy/visibility row on clinic visits
The reviewer's "needs clarification" screenshot showed the meeting RSVP block
(Going? Yes/No/Maybe/Needs Action), the Busy/"User default" status row and
attendee avatars on a clinic booking. The attendees block and Send email were
already hidden; now current_status (Going?), show_as, privacy and the Status
label are invisible for is_clinic visits too — a clinic booking no longer
looks like a meeting invitation. Ordinary calendar meetings keep everything.

Co-Authored-By: Claude Fable 5 <noreply@anthropic.com>
</commit_message>
<xml_diff>
--- a/docs/28.08.26.docx
+++ b/docs/28.08.26.docx
@@ -2603,7 +2603,48 @@
           <w:szCs w:val="22"/>
           <w:lang w:val="ka-GE"/>
         </w:rPr>
+        <w:lastRenderedPageBreak/>
         <w:t xml:space="preserve"> </w:t>
+      </w:r>
+      <w:r>
+        <w:rPr>
+          <w:noProof/>
+        </w:rPr>
+        <w:drawing>
+          <wp:inline distT="0" distB="0" distL="0" distR="0" wp14:anchorId="2D613731" wp14:editId="23020562">
+            <wp:extent cx="5727700" cy="2781300"/>
+            <wp:effectExtent l="0" t="0" r="6350" b="0"/>
+            <wp:docPr id="547769610" name="Picture 1"/>
+            <wp:cNvGraphicFramePr>
+              <a:graphicFrameLocks xmlns:a="http://schemas.openxmlformats.org/drawingml/2006/main" noChangeAspect="1"/>
+            </wp:cNvGraphicFramePr>
+            <a:graphic xmlns:a="http://schemas.openxmlformats.org/drawingml/2006/main">
+              <a:graphicData uri="http://schemas.openxmlformats.org/drawingml/2006/picture">
+                <pic:pic xmlns:pic="http://schemas.openxmlformats.org/drawingml/2006/picture">
+                  <pic:nvPicPr>
+                    <pic:cNvPr id="547769610" name=""/>
+                    <pic:cNvPicPr/>
+                  </pic:nvPicPr>
+                  <pic:blipFill>
+                    <a:blip r:embed="rId26"/>
+                    <a:stretch>
+                      <a:fillRect/>
+                    </a:stretch>
+                  </pic:blipFill>
+                  <pic:spPr>
+                    <a:xfrm>
+                      <a:off x="0" y="0"/>
+                      <a:ext cx="5727700" cy="2781300"/>
+                    </a:xfrm>
+                    <a:prstGeom prst="rect">
+                      <a:avLst/>
+                    </a:prstGeom>
+                  </pic:spPr>
+                </pic:pic>
+              </a:graphicData>
+            </a:graphic>
+          </wp:inline>
+        </w:drawing>
       </w:r>
     </w:p>
     <w:p>
@@ -2772,17 +2813,88 @@
           <w:szCs w:val="22"/>
           <w:lang w:val="ka-GE"/>
         </w:rPr>
-        <w:t xml:space="preserve">არ შეიძლებოდეს პაციენტის ხელახალი </w:t>
-      </w:r>
-      <w:r>
-        <w:rPr>
-          <w:rFonts w:ascii="Helvetica" w:hAnsi="Helvetica"/>
-          <w:sz w:val="22"/>
-          <w:szCs w:val="22"/>
-          <w:lang w:val="ka-GE"/>
-        </w:rPr>
-        <w:lastRenderedPageBreak/>
-        <w:t>რეგისტრაცია</w:t>
+        <w:t>არ შეიძლებოდეს პაციენტის ხელახალი რეგისტრაცია</w:t>
+      </w:r>
+      <w:r>
+        <w:rPr>
+          <w:rFonts w:ascii="Helvetica" w:hAnsi="Helvetica"/>
+          <w:sz w:val="22"/>
+          <w:szCs w:val="22"/>
+          <w:lang w:val="ka-GE"/>
+        </w:rPr>
+        <w:t xml:space="preserve"> </w:t>
+      </w:r>
+      <w:r>
+        <w:rPr>
+          <w:rFonts w:ascii="Helvetica" w:hAnsi="Helvetica"/>
+          <w:sz w:val="22"/>
+          <w:szCs w:val="22"/>
+          <w:highlight w:val="yellow"/>
+          <w:lang w:val="ka-GE"/>
+        </w:rPr>
+        <w:t xml:space="preserve">&gt;&gt; </w:t>
+      </w:r>
+      <w:r>
+        <w:rPr>
+          <w:rFonts w:ascii="Sylfaen" w:hAnsi="Sylfaen"/>
+          <w:sz w:val="22"/>
+          <w:szCs w:val="22"/>
+          <w:highlight w:val="yellow"/>
+          <w:lang w:val="ka-GE"/>
+        </w:rPr>
+        <w:t>გაკეთებულია. შეზღუდულია</w:t>
+      </w:r>
+      <w:r>
+        <w:rPr>
+          <w:rFonts w:ascii="Sylfaen" w:hAnsi="Sylfaen"/>
+          <w:sz w:val="22"/>
+          <w:szCs w:val="22"/>
+          <w:lang w:val="ka-GE"/>
+        </w:rPr>
+        <w:t xml:space="preserve"> </w:t>
+      </w:r>
+      <w:r>
+        <w:rPr>
+          <w:rFonts w:ascii="Sylfaen" w:hAnsi="Sylfaen"/>
+          <w:sz w:val="22"/>
+          <w:szCs w:val="22"/>
+          <w:lang w:val="ka-GE"/>
+        </w:rPr>
+        <w:drawing>
+          <wp:inline distT="0" distB="0" distL="0" distR="0" wp14:anchorId="6E196868" wp14:editId="4DAC1F43">
+            <wp:extent cx="4744112" cy="2286319"/>
+            <wp:effectExtent l="0" t="0" r="0" b="0"/>
+            <wp:docPr id="315134298" name="Picture 1" descr="The image displays a validation error message indicating that a patient with the number 010101 has already been registered.&#10;&#10;AI-generated content may be incorrect."/>
+            <wp:cNvGraphicFramePr>
+              <a:graphicFrameLocks xmlns:a="http://schemas.openxmlformats.org/drawingml/2006/main" noChangeAspect="1"/>
+            </wp:cNvGraphicFramePr>
+            <a:graphic xmlns:a="http://schemas.openxmlformats.org/drawingml/2006/main">
+              <a:graphicData uri="http://schemas.openxmlformats.org/drawingml/2006/picture">
+                <pic:pic xmlns:pic="http://schemas.openxmlformats.org/drawingml/2006/picture">
+                  <pic:nvPicPr>
+                    <pic:cNvPr id="315134298" name="Picture 1" descr="The image displays a validation error message indicating that a patient with the number 010101 has already been registered.&#10;&#10;AI-generated content may be incorrect."/>
+                    <pic:cNvPicPr/>
+                  </pic:nvPicPr>
+                  <pic:blipFill>
+                    <a:blip r:embed="rId27"/>
+                    <a:stretch>
+                      <a:fillRect/>
+                    </a:stretch>
+                  </pic:blipFill>
+                  <pic:spPr>
+                    <a:xfrm>
+                      <a:off x="0" y="0"/>
+                      <a:ext cx="4744112" cy="2286319"/>
+                    </a:xfrm>
+                    <a:prstGeom prst="rect">
+                      <a:avLst/>
+                    </a:prstGeom>
+                  </pic:spPr>
+                </pic:pic>
+              </a:graphicData>
+            </a:graphic>
+          </wp:inline>
+        </w:drawing>
       </w:r>
       <w:r>
         <w:rPr>
@@ -2829,7 +2941,7 @@
     <w:p>
       <w:pPr>
         <w:rPr>
-          <w:rFonts w:ascii="Helvetica" w:hAnsi="Helvetica"/>
+          <w:rFonts w:ascii="Sylfaen" w:hAnsi="Sylfaen"/>
           <w:sz w:val="22"/>
           <w:szCs w:val="22"/>
           <w:lang w:val="ka-GE"/>
@@ -2843,6 +2955,7 @@
           <w:szCs w:val="22"/>
           <w:lang w:val="ka-GE"/>
         </w:rPr>
+        <w:lastRenderedPageBreak/>
         <w:drawing>
           <wp:inline distT="0" distB="0" distL="0" distR="0" wp14:anchorId="54AF04CD" wp14:editId="310FF411">
             <wp:extent cx="3587931" cy="1551760"/>
@@ -2859,7 +2972,7 @@
                     <pic:cNvPicPr/>
                   </pic:nvPicPr>
                   <pic:blipFill>
-                    <a:blip r:embed="rId26">
+                    <a:blip r:embed="rId28">
                       <a:extLst>
                         <a:ext uri="{28A0092B-C50C-407E-A947-70E740481C1C}">
                           <a14:useLocalDpi xmlns:a14="http://schemas.microsoft.com/office/drawing/2010/main" val="0"/>
@@ -2903,6 +3016,35 @@
         </w:rPr>
         <w:t>„პაციენტია“ - არ გვჭირდება</w:t>
       </w:r>
+      <w:r>
+        <w:rPr>
+          <w:rFonts w:ascii="Helvetica" w:hAnsi="Helvetica"/>
+          <w:sz w:val="22"/>
+          <w:szCs w:val="22"/>
+          <w:lang w:val="ka-GE"/>
+        </w:rPr>
+        <w:t xml:space="preserve"> &gt;</w:t>
+      </w:r>
+      <w:r>
+        <w:rPr>
+          <w:rFonts w:ascii="Helvetica" w:hAnsi="Helvetica"/>
+          <w:sz w:val="22"/>
+          <w:szCs w:val="22"/>
+          <w:highlight w:val="yellow"/>
+          <w:lang w:val="ka-GE"/>
+        </w:rPr>
+        <w:t xml:space="preserve">&gt; </w:t>
+      </w:r>
+      <w:r>
+        <w:rPr>
+          <w:rFonts w:ascii="Sylfaen" w:hAnsi="Sylfaen"/>
+          <w:sz w:val="22"/>
+          <w:szCs w:val="22"/>
+          <w:highlight w:val="yellow"/>
+          <w:lang w:val="ka-GE"/>
+        </w:rPr>
+        <w:t>ამოვაგდე ეს სკრინზე რაც არის ზედმეტი იყო</w:t>
+      </w:r>
     </w:p>
     <w:p>
       <w:pPr>
@@ -3058,7 +3200,7 @@
                     <pic:cNvPicPr/>
                   </pic:nvPicPr>
                   <pic:blipFill>
-                    <a:blip r:embed="rId27"/>
+                    <a:blip r:embed="rId29"/>
                     <a:stretch>
                       <a:fillRect/>
                     </a:stretch>
@@ -3250,7 +3392,207 @@
           <w:highlight w:val="yellow"/>
           <w:lang w:val="ka-GE"/>
         </w:rPr>
-        <w:t xml:space="preserve">ეხლა არაფერი არ იგზავნება. </w:t>
+        <w:t>ეხლა არაფერი არ იგზავნება. ფუქნციურად დევს და რასაც ვიტყვით გავაგზავნით</w:t>
+      </w:r>
+      <w:r>
+        <w:rPr>
+          <w:rFonts w:ascii="Helvetica" w:hAnsi="Helvetica"/>
+          <w:sz w:val="22"/>
+          <w:szCs w:val="22"/>
+          <w:lang w:val="ka-GE"/>
+        </w:rPr>
+        <w:br/>
+        <w:t xml:space="preserve">ჯავშნის მომენტში, ივნოისის გაგზავნა, მკურნალობის გაგზავნა, </w:t>
+      </w:r>
+      <w:r>
+        <w:rPr>
+          <w:rFonts w:ascii="Helvetica" w:hAnsi="Helvetica"/>
+          <w:sz w:val="22"/>
+          <w:szCs w:val="22"/>
+          <w:lang w:val="ka-GE"/>
+        </w:rPr>
+        <w:t>ფორმა 100-ის</w:t>
+      </w:r>
+      <w:r>
+        <w:rPr>
+          <w:rFonts w:ascii="Helvetica" w:hAnsi="Helvetica"/>
+          <w:sz w:val="22"/>
+          <w:szCs w:val="22"/>
+          <w:lang w:val="ka-GE"/>
+        </w:rPr>
+        <w:t xml:space="preserve"> გაგზავნა..</w:t>
+      </w:r>
+      <w:r>
+        <w:rPr>
+          <w:rFonts w:ascii="Helvetica" w:hAnsi="Helvetica"/>
+          <w:sz w:val="22"/>
+          <w:szCs w:val="22"/>
+          <w:lang w:val="ka-GE"/>
+        </w:rPr>
+        <w:br/>
+      </w:r>
+      <w:r>
+        <w:rPr>
+          <w:rFonts w:ascii="Helvetica" w:hAnsi="Helvetica"/>
+          <w:sz w:val="22"/>
+          <w:szCs w:val="22"/>
+          <w:lang w:val="ka-GE"/>
+        </w:rPr>
+        <w:br/>
+      </w:r>
+      <w:r>
+        <w:rPr>
+          <w:rFonts w:ascii="Helvetica" w:hAnsi="Helvetica"/>
+          <w:sz w:val="22"/>
+          <w:szCs w:val="22"/>
+          <w:lang w:val="ka-GE"/>
+        </w:rPr>
+        <w:t xml:space="preserve">პაციენტების ცალკე კატეგორიაა ე.წ. </w:t>
+      </w:r>
+      <w:r>
+        <w:rPr>
+          <w:rFonts w:ascii="Helvetica" w:hAnsi="Helvetica"/>
+          <w:sz w:val="22"/>
+          <w:szCs w:val="22"/>
+          <w:lang w:val="ka-GE"/>
+        </w:rPr>
+        <w:t>„დისპანსერიზაციის“ პაციენტები</w:t>
+      </w:r>
+      <w:r>
+        <w:rPr>
+          <w:rFonts w:ascii="Helvetica" w:hAnsi="Helvetica"/>
+          <w:sz w:val="22"/>
+          <w:szCs w:val="22"/>
+          <w:lang w:val="ka-GE"/>
+        </w:rPr>
+        <w:t xml:space="preserve">, რომელებით 6 თვეში ეწერებიან კონტროლზე, ესენი  (6 თვეში ჩაწერილები) </w:t>
+      </w:r>
+      <w:r>
+        <w:rPr>
+          <w:rFonts w:ascii="Helvetica" w:hAnsi="Helvetica"/>
+          <w:sz w:val="22"/>
+          <w:szCs w:val="22"/>
+          <w:lang w:val="ka-GE"/>
+        </w:rPr>
+        <w:t>სხვა ფერით</w:t>
+      </w:r>
+      <w:r>
+        <w:rPr>
+          <w:rFonts w:ascii="Helvetica" w:hAnsi="Helvetica"/>
+          <w:sz w:val="22"/>
+          <w:szCs w:val="22"/>
+          <w:lang w:val="ka-GE"/>
+        </w:rPr>
+        <w:t xml:space="preserve"> ინიშნებოდეს</w:t>
+      </w:r>
+      <w:r>
+        <w:rPr>
+          <w:rFonts w:ascii="Helvetica" w:hAnsi="Helvetica"/>
+          <w:sz w:val="22"/>
+          <w:szCs w:val="22"/>
+          <w:lang w:val="ka-GE"/>
+        </w:rPr>
+        <w:t xml:space="preserve"> </w:t>
+      </w:r>
+      <w:r>
+        <w:rPr>
+          <w:rFonts w:ascii="Helvetica" w:hAnsi="Helvetica"/>
+          <w:sz w:val="22"/>
+          <w:szCs w:val="22"/>
+          <w:lang w:val="ka-GE"/>
+        </w:rPr>
+        <w:lastRenderedPageBreak/>
+        <w:t>კალენდარში „</w:t>
+      </w:r>
+      <w:r>
+        <w:rPr>
+          <w:rFonts w:ascii="Helvetica" w:hAnsi="Helvetica"/>
+          <w:sz w:val="22"/>
+          <w:szCs w:val="22"/>
+          <w:lang w:val="ka-GE"/>
+        </w:rPr>
+        <w:t>სარეზერვო</w:t>
+      </w:r>
+      <w:r>
+        <w:rPr>
+          <w:rFonts w:ascii="Helvetica" w:hAnsi="Helvetica"/>
+          <w:sz w:val="22"/>
+          <w:szCs w:val="22"/>
+          <w:lang w:val="ka-GE"/>
+        </w:rPr>
+        <w:t xml:space="preserve">“ ველში ჩავარდეს, </w:t>
+      </w:r>
+      <w:r>
+        <w:rPr>
+          <w:rFonts w:ascii="Helvetica" w:hAnsi="Helvetica"/>
+          <w:sz w:val="22"/>
+          <w:szCs w:val="22"/>
+          <w:lang w:val="ka-GE"/>
+        </w:rPr>
+        <w:t xml:space="preserve"> </w:t>
+      </w:r>
+      <w:r>
+        <w:rPr>
+          <w:rFonts w:ascii="Helvetica" w:hAnsi="Helvetica"/>
+          <w:sz w:val="22"/>
+          <w:szCs w:val="22"/>
+          <w:lang w:val="ka-GE"/>
+        </w:rPr>
+        <w:t>მხოლოდ</w:t>
+      </w:r>
+      <w:r>
+        <w:rPr>
+          <w:rFonts w:ascii="Helvetica" w:hAnsi="Helvetica"/>
+          <w:sz w:val="22"/>
+          <w:szCs w:val="22"/>
+          <w:lang w:val="ka-GE"/>
+        </w:rPr>
+        <w:t xml:space="preserve"> დადასტურების შემდეგ </w:t>
+      </w:r>
+      <w:r>
+        <w:rPr>
+          <w:rFonts w:ascii="Helvetica" w:hAnsi="Helvetica"/>
+          <w:sz w:val="22"/>
+          <w:szCs w:val="22"/>
+          <w:lang w:val="ka-GE"/>
+        </w:rPr>
+        <w:t>გადავიდეს</w:t>
+      </w:r>
+      <w:r>
+        <w:rPr>
+          <w:rFonts w:ascii="Helvetica" w:hAnsi="Helvetica"/>
+          <w:sz w:val="22"/>
+          <w:szCs w:val="22"/>
+          <w:lang w:val="ka-GE"/>
+        </w:rPr>
+        <w:t xml:space="preserve"> </w:t>
+      </w:r>
+      <w:r>
+        <w:rPr>
+          <w:rFonts w:ascii="Helvetica" w:hAnsi="Helvetica"/>
+          <w:sz w:val="22"/>
+          <w:szCs w:val="22"/>
+          <w:lang w:val="ka-GE"/>
+        </w:rPr>
+        <w:t xml:space="preserve">მთავარ </w:t>
+      </w:r>
+      <w:r>
+        <w:rPr>
+          <w:rFonts w:ascii="Helvetica" w:hAnsi="Helvetica"/>
+          <w:sz w:val="22"/>
+          <w:szCs w:val="22"/>
+          <w:lang w:val="ka-GE"/>
+        </w:rPr>
+        <w:t>კალენდარში</w:t>
+      </w:r>
+      <w:r>
+        <w:rPr>
+          <w:rFonts w:ascii="Helvetica" w:hAnsi="Helvetica"/>
+          <w:sz w:val="22"/>
+          <w:szCs w:val="22"/>
+          <w:lang w:val="ka-GE"/>
+        </w:rPr>
+        <w:t>&gt;&gt;&gt;</w:t>
       </w:r>
       <w:r>
         <w:rPr>
@@ -3260,103 +3602,11 @@
           <w:highlight w:val="yellow"/>
           <w:lang w:val="ka-GE"/>
         </w:rPr>
-        <w:lastRenderedPageBreak/>
-        <w:t>ფუქნციურად დევს და რასაც ვიტყვით გავაგზავნით</w:t>
-      </w:r>
-      <w:r>
-        <w:rPr>
-          <w:rFonts w:ascii="Helvetica" w:hAnsi="Helvetica"/>
-          <w:sz w:val="22"/>
-          <w:szCs w:val="22"/>
-          <w:lang w:val="ka-GE"/>
-        </w:rPr>
-        <w:br/>
-        <w:t xml:space="preserve">ჯავშნის მომენტში, ივნოისის გაგზავნა, მკურნალობის გაგზავნა, </w:t>
-      </w:r>
-      <w:r>
-        <w:rPr>
-          <w:rFonts w:ascii="Helvetica" w:hAnsi="Helvetica"/>
-          <w:sz w:val="22"/>
-          <w:szCs w:val="22"/>
-          <w:lang w:val="ka-GE"/>
-        </w:rPr>
-        <w:t>ფორმა 100-ის</w:t>
-      </w:r>
-      <w:r>
-        <w:rPr>
-          <w:rFonts w:ascii="Helvetica" w:hAnsi="Helvetica"/>
-          <w:sz w:val="22"/>
-          <w:szCs w:val="22"/>
-          <w:lang w:val="ka-GE"/>
-        </w:rPr>
-        <w:t xml:space="preserve"> გაგზავნა..</w:t>
-      </w:r>
-      <w:r>
-        <w:rPr>
-          <w:rFonts w:ascii="Helvetica" w:hAnsi="Helvetica"/>
-          <w:sz w:val="22"/>
-          <w:szCs w:val="22"/>
-          <w:lang w:val="ka-GE"/>
-        </w:rPr>
-        <w:br/>
-      </w:r>
-      <w:r>
-        <w:rPr>
-          <w:rFonts w:ascii="Helvetica" w:hAnsi="Helvetica"/>
-          <w:sz w:val="22"/>
-          <w:szCs w:val="22"/>
-          <w:lang w:val="ka-GE"/>
-        </w:rPr>
-        <w:br/>
-      </w:r>
-      <w:r>
-        <w:rPr>
-          <w:rFonts w:ascii="Helvetica" w:hAnsi="Helvetica"/>
-          <w:sz w:val="22"/>
-          <w:szCs w:val="22"/>
-          <w:lang w:val="ka-GE"/>
-        </w:rPr>
-        <w:t xml:space="preserve">პაციენტების ცალკე კატეგორიაა ე.წ. </w:t>
-      </w:r>
-      <w:r>
-        <w:rPr>
-          <w:rFonts w:ascii="Helvetica" w:hAnsi="Helvetica"/>
-          <w:sz w:val="22"/>
-          <w:szCs w:val="22"/>
-          <w:lang w:val="ka-GE"/>
-        </w:rPr>
-        <w:t>„დისპანსერიზაციის“ პაციენტები</w:t>
-      </w:r>
-      <w:r>
-        <w:rPr>
-          <w:rFonts w:ascii="Helvetica" w:hAnsi="Helvetica"/>
-          <w:sz w:val="22"/>
-          <w:szCs w:val="22"/>
-          <w:lang w:val="ka-GE"/>
-        </w:rPr>
-        <w:t xml:space="preserve">, რომელებით 6 თვეში ეწერებიან კონტროლზე, ესენი  (6 თვეში ჩაწერილები) </w:t>
-      </w:r>
-      <w:r>
-        <w:rPr>
-          <w:rFonts w:ascii="Helvetica" w:hAnsi="Helvetica"/>
-          <w:sz w:val="22"/>
-          <w:szCs w:val="22"/>
-          <w:lang w:val="ka-GE"/>
-        </w:rPr>
-        <w:t>სხვა ფერით</w:t>
-      </w:r>
-      <w:r>
-        <w:rPr>
-          <w:rFonts w:ascii="Helvetica" w:hAnsi="Helvetica"/>
-          <w:sz w:val="22"/>
-          <w:szCs w:val="22"/>
-          <w:lang w:val="ka-GE"/>
-        </w:rPr>
-        <w:t xml:space="preserve"> ინიშნებოდეს</w:t>
-      </w:r>
-      <w:r>
-        <w:rPr>
-          <w:rFonts w:ascii="Helvetica" w:hAnsi="Helvetica"/>
+        <w:t>მას შემდეგ გადავა კალენდარში როცა დაადასტურებთ</w:t>
+      </w:r>
+      <w:r>
+        <w:rPr>
+          <w:rFonts w:ascii="Sylfaen" w:hAnsi="Sylfaen"/>
           <w:sz w:val="22"/>
           <w:szCs w:val="22"/>
           <w:lang w:val="ka-GE"/>
@@ -3365,93 +3615,43 @@
       </w:r>
       <w:r>
         <w:rPr>
-          <w:rFonts w:ascii="Helvetica" w:hAnsi="Helvetica"/>
-          <w:sz w:val="22"/>
-          <w:szCs w:val="22"/>
-          <w:lang w:val="ka-GE"/>
-        </w:rPr>
-        <w:t>კალენდარში „</w:t>
-      </w:r>
-      <w:r>
-        <w:rPr>
-          <w:rFonts w:ascii="Helvetica" w:hAnsi="Helvetica"/>
-          <w:sz w:val="22"/>
-          <w:szCs w:val="22"/>
-          <w:lang w:val="ka-GE"/>
-        </w:rPr>
-        <w:t>სარეზერვო</w:t>
-      </w:r>
-      <w:r>
-        <w:rPr>
-          <w:rFonts w:ascii="Helvetica" w:hAnsi="Helvetica"/>
-          <w:sz w:val="22"/>
-          <w:szCs w:val="22"/>
-          <w:lang w:val="ka-GE"/>
-        </w:rPr>
-        <w:t xml:space="preserve">“ ველში ჩავარდეს, </w:t>
-      </w:r>
-      <w:r>
-        <w:rPr>
-          <w:rFonts w:ascii="Helvetica" w:hAnsi="Helvetica"/>
-          <w:sz w:val="22"/>
-          <w:szCs w:val="22"/>
-          <w:lang w:val="ka-GE"/>
-        </w:rPr>
-        <w:t xml:space="preserve"> </w:t>
-      </w:r>
-      <w:r>
-        <w:rPr>
-          <w:rFonts w:ascii="Helvetica" w:hAnsi="Helvetica"/>
-          <w:sz w:val="22"/>
-          <w:szCs w:val="22"/>
-          <w:lang w:val="ka-GE"/>
-        </w:rPr>
-        <w:t>მხოლოდ</w:t>
-      </w:r>
-      <w:r>
-        <w:rPr>
-          <w:rFonts w:ascii="Helvetica" w:hAnsi="Helvetica"/>
-          <w:sz w:val="22"/>
-          <w:szCs w:val="22"/>
-          <w:lang w:val="ka-GE"/>
-        </w:rPr>
-        <w:t xml:space="preserve"> დადასტურების შემდეგ </w:t>
-      </w:r>
-      <w:r>
-        <w:rPr>
-          <w:rFonts w:ascii="Helvetica" w:hAnsi="Helvetica"/>
-          <w:sz w:val="22"/>
-          <w:szCs w:val="22"/>
-          <w:lang w:val="ka-GE"/>
-        </w:rPr>
-        <w:t>გადავიდეს</w:t>
-      </w:r>
-      <w:r>
-        <w:rPr>
-          <w:rFonts w:ascii="Helvetica" w:hAnsi="Helvetica"/>
-          <w:sz w:val="22"/>
-          <w:szCs w:val="22"/>
-          <w:lang w:val="ka-GE"/>
-        </w:rPr>
-        <w:t xml:space="preserve"> </w:t>
-      </w:r>
-      <w:r>
-        <w:rPr>
-          <w:rFonts w:ascii="Helvetica" w:hAnsi="Helvetica"/>
-          <w:sz w:val="22"/>
-          <w:szCs w:val="22"/>
-          <w:lang w:val="ka-GE"/>
-        </w:rPr>
-        <w:t xml:space="preserve">მთავარ </w:t>
-      </w:r>
-      <w:r>
-        <w:rPr>
-          <w:rFonts w:ascii="Helvetica" w:hAnsi="Helvetica"/>
-          <w:sz w:val="22"/>
-          <w:szCs w:val="22"/>
-          <w:lang w:val="ka-GE"/>
-        </w:rPr>
-        <w:t>კალენდარში</w:t>
+          <w:noProof/>
+        </w:rPr>
+        <w:drawing>
+          <wp:inline distT="0" distB="0" distL="0" distR="0" wp14:anchorId="3BBCCFC2" wp14:editId="78505A85">
+            <wp:extent cx="5727700" cy="4875530"/>
+            <wp:effectExtent l="0" t="0" r="6350" b="1270"/>
+            <wp:docPr id="1148164809" name="Picture 1"/>
+            <wp:cNvGraphicFramePr>
+              <a:graphicFrameLocks xmlns:a="http://schemas.openxmlformats.org/drawingml/2006/main" noChangeAspect="1"/>
+            </wp:cNvGraphicFramePr>
+            <a:graphic xmlns:a="http://schemas.openxmlformats.org/drawingml/2006/main">
+              <a:graphicData uri="http://schemas.openxmlformats.org/drawingml/2006/picture">
+                <pic:pic xmlns:pic="http://schemas.openxmlformats.org/drawingml/2006/picture">
+                  <pic:nvPicPr>
+                    <pic:cNvPr id="1148164809" name=""/>
+                    <pic:cNvPicPr/>
+                  </pic:nvPicPr>
+                  <pic:blipFill>
+                    <a:blip r:embed="rId30"/>
+                    <a:stretch>
+                      <a:fillRect/>
+                    </a:stretch>
+                  </pic:blipFill>
+                  <pic:spPr>
+                    <a:xfrm>
+                      <a:off x="0" y="0"/>
+                      <a:ext cx="5727700" cy="4875530"/>
+                    </a:xfrm>
+                    <a:prstGeom prst="rect">
+                      <a:avLst/>
+                    </a:prstGeom>
+                  </pic:spPr>
+                </pic:pic>
+              </a:graphicData>
+            </a:graphic>
+          </wp:inline>
+        </w:drawing>
       </w:r>
       <w:r>
         <w:rPr>
@@ -3520,7 +3720,7 @@
     <w:p>
       <w:pPr>
         <w:rPr>
-          <w:rFonts w:ascii="Helvetica" w:hAnsi="Helvetica"/>
+          <w:rFonts w:ascii="Sylfaen" w:hAnsi="Sylfaen"/>
           <w:sz w:val="22"/>
           <w:szCs w:val="22"/>
           <w:lang w:val="ka-GE"/>
@@ -3579,6 +3779,35 @@
           <w:lang w:val="ka-GE"/>
         </w:rPr>
         <w:t>თან.</w:t>
+      </w:r>
+      <w:r>
+        <w:rPr>
+          <w:rFonts w:ascii="Helvetica" w:hAnsi="Helvetica"/>
+          <w:sz w:val="22"/>
+          <w:szCs w:val="22"/>
+          <w:lang w:val="ka-GE"/>
+        </w:rPr>
+        <w:t xml:space="preserve"> </w:t>
+      </w:r>
+      <w:r>
+        <w:rPr>
+          <w:rFonts w:ascii="Helvetica" w:hAnsi="Helvetica"/>
+          <w:sz w:val="22"/>
+          <w:szCs w:val="22"/>
+          <w:highlight w:val="yellow"/>
+          <w:lang w:val="ka-GE"/>
+        </w:rPr>
+        <w:t xml:space="preserve">&gt;&gt; </w:t>
+      </w:r>
+      <w:r>
+        <w:rPr>
+          <w:rFonts w:ascii="Sylfaen" w:hAnsi="Sylfaen"/>
+          <w:sz w:val="22"/>
+          <w:szCs w:val="22"/>
+          <w:highlight w:val="yellow"/>
+          <w:lang w:val="ka-GE"/>
+        </w:rPr>
+        <w:t>ეს გავიაროთ შეხვედრაზე</w:t>
       </w:r>
     </w:p>
     <w:sectPr>

</xml_diff>

<commit_message>
feat(clinic): patient jump buttons on the visit (reviewer: buttons over arrows)
The reviewer's "instead of arrows we need proper buttons (e.g. to reach the
patient's form)" item: the only way from a visit to its patient was the tiny
m2o internal-link arrow. The Clinic tab now opens with two explicit buttons
(shown once a patient is set):
- "👤 პაციენტის ანკეტა" -> the patient's standard form;
- "🪪 პაციენტის ბარათი" -> the Soft-UI patient card page.
Both close the visit dialog and navigate; verified live (act_window to the
patient / client action with the right active_id; buttons in the arch).

Co-Authored-By: Claude Fable 5 <noreply@anthropic.com>
</commit_message>
<xml_diff>
--- a/docs/28.08.26.docx
+++ b/docs/28.08.26.docx
@@ -2236,36 +2236,16 @@
           <w:szCs w:val="22"/>
           <w:lang w:val="ka-GE"/>
         </w:rPr>
-        <w:t>ნაცვლად იყოს „</w:t>
-      </w:r>
-      <w:proofErr w:type="gramStart"/>
-      <w:r>
-        <w:rPr>
-          <w:rFonts w:ascii="Helvetica" w:hAnsi="Helvetica"/>
-          <w:sz w:val="22"/>
-          <w:szCs w:val="22"/>
-          <w:lang w:val="ka-GE"/>
-        </w:rPr>
-        <w:t>დაჯავშნე“</w:t>
-      </w:r>
-      <w:r>
-        <w:rPr>
-          <w:rFonts w:ascii="Helvetica" w:hAnsi="Helvetica"/>
-          <w:sz w:val="22"/>
-          <w:szCs w:val="22"/>
-          <w:lang w:val="ka-GE"/>
-        </w:rPr>
-        <w:t xml:space="preserve"> &gt;</w:t>
-      </w:r>
-      <w:proofErr w:type="gramEnd"/>
-      <w:r>
-        <w:rPr>
-          <w:rFonts w:ascii="Helvetica" w:hAnsi="Helvetica"/>
-          <w:sz w:val="22"/>
-          <w:szCs w:val="22"/>
-          <w:lang w:val="ka-GE"/>
-        </w:rPr>
-        <w:t xml:space="preserve">&gt; </w:t>
+        <w:t>ნაცვლად იყოს „დაჯავშნე“</w:t>
+      </w:r>
+      <w:r>
+        <w:rPr>
+          <w:rFonts w:ascii="Helvetica" w:hAnsi="Helvetica"/>
+          <w:sz w:val="22"/>
+          <w:szCs w:val="22"/>
+          <w:lang w:val="ka-GE"/>
+        </w:rPr>
+        <w:t xml:space="preserve"> &gt;&gt; </w:t>
       </w:r>
       <w:r>
         <w:rPr>
@@ -2759,6 +2739,58 @@
           <w:szCs w:val="22"/>
           <w:lang w:val="ka-GE"/>
         </w:rPr>
+        <w:t xml:space="preserve"> &gt;&gt;&gt;</w:t>
+      </w:r>
+      <w:r>
+        <w:rPr>
+          <w:rFonts w:ascii="Helvetica" w:hAnsi="Helvetica"/>
+          <w:sz w:val="22"/>
+          <w:szCs w:val="22"/>
+          <w:lang w:val="ka-GE"/>
+        </w:rPr>
+        <w:drawing>
+          <wp:inline distT="0" distB="0" distL="0" distR="0" wp14:anchorId="33991E01" wp14:editId="2661BD60">
+            <wp:extent cx="5727700" cy="4046220"/>
+            <wp:effectExtent l="0" t="0" r="6350" b="0"/>
+            <wp:docPr id="1390158835" name="Picture 1"/>
+            <wp:cNvGraphicFramePr>
+              <a:graphicFrameLocks xmlns:a="http://schemas.openxmlformats.org/drawingml/2006/main" noChangeAspect="1"/>
+            </wp:cNvGraphicFramePr>
+            <a:graphic xmlns:a="http://schemas.openxmlformats.org/drawingml/2006/main">
+              <a:graphicData uri="http://schemas.openxmlformats.org/drawingml/2006/picture">
+                <pic:pic xmlns:pic="http://schemas.openxmlformats.org/drawingml/2006/picture">
+                  <pic:nvPicPr>
+                    <pic:cNvPr id="1390158835" name=""/>
+                    <pic:cNvPicPr/>
+                  </pic:nvPicPr>
+                  <pic:blipFill>
+                    <a:blip r:embed="rId27"/>
+                    <a:stretch>
+                      <a:fillRect/>
+                    </a:stretch>
+                  </pic:blipFill>
+                  <pic:spPr>
+                    <a:xfrm>
+                      <a:off x="0" y="0"/>
+                      <a:ext cx="5727700" cy="4046220"/>
+                    </a:xfrm>
+                    <a:prstGeom prst="rect">
+                      <a:avLst/>
+                    </a:prstGeom>
+                  </pic:spPr>
+                </pic:pic>
+              </a:graphicData>
+            </a:graphic>
+          </wp:inline>
+        </w:drawing>
+      </w:r>
+      <w:r>
+        <w:rPr>
+          <w:rFonts w:ascii="Helvetica" w:hAnsi="Helvetica"/>
+          <w:sz w:val="22"/>
+          <w:szCs w:val="22"/>
+          <w:lang w:val="ka-GE"/>
+        </w:rPr>
         <w:br/>
       </w:r>
       <w:r>
@@ -2860,6 +2892,7 @@
           <w:szCs w:val="22"/>
           <w:lang w:val="ka-GE"/>
         </w:rPr>
+        <w:lastRenderedPageBreak/>
         <w:drawing>
           <wp:inline distT="0" distB="0" distL="0" distR="0" wp14:anchorId="6E196868" wp14:editId="4DAC1F43">
             <wp:extent cx="4744112" cy="2286319"/>
@@ -2876,7 +2909,7 @@
                     <pic:cNvPicPr/>
                   </pic:nvPicPr>
                   <pic:blipFill>
-                    <a:blip r:embed="rId27"/>
+                    <a:blip r:embed="rId28"/>
                     <a:stretch>
                       <a:fillRect/>
                     </a:stretch>
@@ -2955,7 +2988,6 @@
           <w:szCs w:val="22"/>
           <w:lang w:val="ka-GE"/>
         </w:rPr>
-        <w:lastRenderedPageBreak/>
         <w:drawing>
           <wp:inline distT="0" distB="0" distL="0" distR="0" wp14:anchorId="54AF04CD" wp14:editId="310FF411">
             <wp:extent cx="3587931" cy="1551760"/>
@@ -2972,7 +3004,7 @@
                     <pic:cNvPicPr/>
                   </pic:nvPicPr>
                   <pic:blipFill>
-                    <a:blip r:embed="rId28">
+                    <a:blip r:embed="rId29">
                       <a:extLst>
                         <a:ext uri="{28A0092B-C50C-407E-A947-70E740481C1C}">
                           <a14:useLocalDpi xmlns:a14="http://schemas.microsoft.com/office/drawing/2010/main" val="0"/>
@@ -3184,6 +3216,7 @@
         <w:rPr>
           <w:noProof/>
         </w:rPr>
+        <w:lastRenderedPageBreak/>
         <w:drawing>
           <wp:inline distT="0" distB="0" distL="0" distR="0" wp14:anchorId="2F26091C" wp14:editId="6FB89511">
             <wp:extent cx="5727700" cy="2909570"/>
@@ -3200,7 +3233,7 @@
                     <pic:cNvPicPr/>
                   </pic:nvPicPr>
                   <pic:blipFill>
-                    <a:blip r:embed="rId29"/>
+                    <a:blip r:embed="rId30"/>
                     <a:stretch>
                       <a:fillRect/>
                     </a:stretch>
@@ -3501,122 +3534,122 @@
           <w:szCs w:val="22"/>
           <w:lang w:val="ka-GE"/>
         </w:rPr>
+        <w:t>კალენდარში „</w:t>
+      </w:r>
+      <w:r>
+        <w:rPr>
+          <w:rFonts w:ascii="Helvetica" w:hAnsi="Helvetica"/>
+          <w:sz w:val="22"/>
+          <w:szCs w:val="22"/>
+          <w:lang w:val="ka-GE"/>
+        </w:rPr>
+        <w:t>სარეზერვო</w:t>
+      </w:r>
+      <w:r>
+        <w:rPr>
+          <w:rFonts w:ascii="Helvetica" w:hAnsi="Helvetica"/>
+          <w:sz w:val="22"/>
+          <w:szCs w:val="22"/>
+          <w:lang w:val="ka-GE"/>
+        </w:rPr>
+        <w:t xml:space="preserve">“ ველში ჩავარდეს, </w:t>
+      </w:r>
+      <w:r>
+        <w:rPr>
+          <w:rFonts w:ascii="Helvetica" w:hAnsi="Helvetica"/>
+          <w:sz w:val="22"/>
+          <w:szCs w:val="22"/>
+          <w:lang w:val="ka-GE"/>
+        </w:rPr>
+        <w:t xml:space="preserve"> </w:t>
+      </w:r>
+      <w:r>
+        <w:rPr>
+          <w:rFonts w:ascii="Helvetica" w:hAnsi="Helvetica"/>
+          <w:sz w:val="22"/>
+          <w:szCs w:val="22"/>
+          <w:lang w:val="ka-GE"/>
+        </w:rPr>
+        <w:t>მხოლოდ</w:t>
+      </w:r>
+      <w:r>
+        <w:rPr>
+          <w:rFonts w:ascii="Helvetica" w:hAnsi="Helvetica"/>
+          <w:sz w:val="22"/>
+          <w:szCs w:val="22"/>
+          <w:lang w:val="ka-GE"/>
+        </w:rPr>
+        <w:t xml:space="preserve"> დადასტურების შემდეგ </w:t>
+      </w:r>
+      <w:r>
+        <w:rPr>
+          <w:rFonts w:ascii="Helvetica" w:hAnsi="Helvetica"/>
+          <w:sz w:val="22"/>
+          <w:szCs w:val="22"/>
+          <w:lang w:val="ka-GE"/>
+        </w:rPr>
+        <w:t>გადავიდეს</w:t>
+      </w:r>
+      <w:r>
+        <w:rPr>
+          <w:rFonts w:ascii="Helvetica" w:hAnsi="Helvetica"/>
+          <w:sz w:val="22"/>
+          <w:szCs w:val="22"/>
+          <w:lang w:val="ka-GE"/>
+        </w:rPr>
+        <w:t xml:space="preserve"> </w:t>
+      </w:r>
+      <w:r>
+        <w:rPr>
+          <w:rFonts w:ascii="Helvetica" w:hAnsi="Helvetica"/>
+          <w:sz w:val="22"/>
+          <w:szCs w:val="22"/>
+          <w:lang w:val="ka-GE"/>
+        </w:rPr>
+        <w:t xml:space="preserve">მთავარ </w:t>
+      </w:r>
+      <w:r>
+        <w:rPr>
+          <w:rFonts w:ascii="Helvetica" w:hAnsi="Helvetica"/>
+          <w:sz w:val="22"/>
+          <w:szCs w:val="22"/>
+          <w:lang w:val="ka-GE"/>
+        </w:rPr>
+        <w:t>კალენდარში</w:t>
+      </w:r>
+      <w:r>
+        <w:rPr>
+          <w:rFonts w:ascii="Helvetica" w:hAnsi="Helvetica"/>
+          <w:sz w:val="22"/>
+          <w:szCs w:val="22"/>
+          <w:lang w:val="ka-GE"/>
+        </w:rPr>
+        <w:t>&gt;&gt;&gt;</w:t>
+      </w:r>
+      <w:r>
+        <w:rPr>
+          <w:rFonts w:ascii="Sylfaen" w:hAnsi="Sylfaen"/>
+          <w:sz w:val="22"/>
+          <w:szCs w:val="22"/>
+          <w:highlight w:val="yellow"/>
+          <w:lang w:val="ka-GE"/>
+        </w:rPr>
+        <w:t>მას შემდეგ გადავა კალენდარში როცა დაადასტურებთ</w:t>
+      </w:r>
+      <w:r>
+        <w:rPr>
+          <w:rFonts w:ascii="Sylfaen" w:hAnsi="Sylfaen"/>
+          <w:sz w:val="22"/>
+          <w:szCs w:val="22"/>
+          <w:lang w:val="ka-GE"/>
+        </w:rPr>
+        <w:t xml:space="preserve"> </w:t>
+      </w:r>
+      <w:r>
+        <w:rPr>
+          <w:noProof/>
+        </w:rPr>
         <w:lastRenderedPageBreak/>
-        <w:t>კალენდარში „</w:t>
-      </w:r>
-      <w:r>
-        <w:rPr>
-          <w:rFonts w:ascii="Helvetica" w:hAnsi="Helvetica"/>
-          <w:sz w:val="22"/>
-          <w:szCs w:val="22"/>
-          <w:lang w:val="ka-GE"/>
-        </w:rPr>
-        <w:t>სარეზერვო</w:t>
-      </w:r>
-      <w:r>
-        <w:rPr>
-          <w:rFonts w:ascii="Helvetica" w:hAnsi="Helvetica"/>
-          <w:sz w:val="22"/>
-          <w:szCs w:val="22"/>
-          <w:lang w:val="ka-GE"/>
-        </w:rPr>
-        <w:t xml:space="preserve">“ ველში ჩავარდეს, </w:t>
-      </w:r>
-      <w:r>
-        <w:rPr>
-          <w:rFonts w:ascii="Helvetica" w:hAnsi="Helvetica"/>
-          <w:sz w:val="22"/>
-          <w:szCs w:val="22"/>
-          <w:lang w:val="ka-GE"/>
-        </w:rPr>
-        <w:t xml:space="preserve"> </w:t>
-      </w:r>
-      <w:r>
-        <w:rPr>
-          <w:rFonts w:ascii="Helvetica" w:hAnsi="Helvetica"/>
-          <w:sz w:val="22"/>
-          <w:szCs w:val="22"/>
-          <w:lang w:val="ka-GE"/>
-        </w:rPr>
-        <w:t>მხოლოდ</w:t>
-      </w:r>
-      <w:r>
-        <w:rPr>
-          <w:rFonts w:ascii="Helvetica" w:hAnsi="Helvetica"/>
-          <w:sz w:val="22"/>
-          <w:szCs w:val="22"/>
-          <w:lang w:val="ka-GE"/>
-        </w:rPr>
-        <w:t xml:space="preserve"> დადასტურების შემდეგ </w:t>
-      </w:r>
-      <w:r>
-        <w:rPr>
-          <w:rFonts w:ascii="Helvetica" w:hAnsi="Helvetica"/>
-          <w:sz w:val="22"/>
-          <w:szCs w:val="22"/>
-          <w:lang w:val="ka-GE"/>
-        </w:rPr>
-        <w:t>გადავიდეს</w:t>
-      </w:r>
-      <w:r>
-        <w:rPr>
-          <w:rFonts w:ascii="Helvetica" w:hAnsi="Helvetica"/>
-          <w:sz w:val="22"/>
-          <w:szCs w:val="22"/>
-          <w:lang w:val="ka-GE"/>
-        </w:rPr>
-        <w:t xml:space="preserve"> </w:t>
-      </w:r>
-      <w:r>
-        <w:rPr>
-          <w:rFonts w:ascii="Helvetica" w:hAnsi="Helvetica"/>
-          <w:sz w:val="22"/>
-          <w:szCs w:val="22"/>
-          <w:lang w:val="ka-GE"/>
-        </w:rPr>
-        <w:t xml:space="preserve">მთავარ </w:t>
-      </w:r>
-      <w:r>
-        <w:rPr>
-          <w:rFonts w:ascii="Helvetica" w:hAnsi="Helvetica"/>
-          <w:sz w:val="22"/>
-          <w:szCs w:val="22"/>
-          <w:lang w:val="ka-GE"/>
-        </w:rPr>
-        <w:t>კალენდარში</w:t>
-      </w:r>
-      <w:r>
-        <w:rPr>
-          <w:rFonts w:ascii="Helvetica" w:hAnsi="Helvetica"/>
-          <w:sz w:val="22"/>
-          <w:szCs w:val="22"/>
-          <w:lang w:val="ka-GE"/>
-        </w:rPr>
-        <w:t>&gt;&gt;&gt;</w:t>
-      </w:r>
-      <w:r>
-        <w:rPr>
-          <w:rFonts w:ascii="Sylfaen" w:hAnsi="Sylfaen"/>
-          <w:sz w:val="22"/>
-          <w:szCs w:val="22"/>
-          <w:highlight w:val="yellow"/>
-          <w:lang w:val="ka-GE"/>
-        </w:rPr>
-        <w:t>მას შემდეგ გადავა კალენდარში როცა დაადასტურებთ</w:t>
-      </w:r>
-      <w:r>
-        <w:rPr>
-          <w:rFonts w:ascii="Sylfaen" w:hAnsi="Sylfaen"/>
-          <w:sz w:val="22"/>
-          <w:szCs w:val="22"/>
-          <w:lang w:val="ka-GE"/>
-        </w:rPr>
-        <w:t xml:space="preserve"> </w:t>
-      </w:r>
-      <w:r>
-        <w:rPr>
-          <w:noProof/>
-        </w:rPr>
         <w:drawing>
           <wp:inline distT="0" distB="0" distL="0" distR="0" wp14:anchorId="3BBCCFC2" wp14:editId="78505A85">
             <wp:extent cx="5727700" cy="4875530"/>
@@ -3633,7 +3666,7 @@
                     <pic:cNvPicPr/>
                   </pic:nvPicPr>
                   <pic:blipFill>
-                    <a:blip r:embed="rId30"/>
+                    <a:blip r:embed="rId31"/>
                     <a:stretch>
                       <a:fillRect/>
                     </a:stretch>

</xml_diff>

<commit_message>
fix(clinic): cancellation reason field visible before cancelling
Cancelling was impossible from the UI: action_cancel demands a reason, but
the cancel_reason field was only visible once clinic_state was already
'cancelled' — a chicken-and-egg. The field now shows on every live state
(hidden only for done/paid/no-show) with a "Required to cancel" placeholder,
so staff type the reason first and then hit Cancel. Verified live: reason +
action_cancel -> cancelled with the reason stored.

Co-Authored-By: Claude Fable 5 <noreply@anthropic.com>
</commit_message>
<xml_diff>
--- a/docs/28.08.26.docx
+++ b/docs/28.08.26.docx
@@ -2749,10 +2749,10 @@
           <w:lang w:val="ka-GE"/>
         </w:rPr>
         <w:drawing>
-          <wp:inline distT="0" distB="0" distL="0" distR="0" wp14:anchorId="33991E01" wp14:editId="2661BD60">
+          <wp:inline distT="0" distB="0" distL="0" distR="0" wp14:anchorId="33991E01" wp14:editId="440A42EA">
             <wp:extent cx="5727700" cy="4046220"/>
             <wp:effectExtent l="0" t="0" r="6350" b="0"/>
-            <wp:docPr id="1390158835" name="Picture 1"/>
+            <wp:docPr id="1390158835" name="Picture 1" descr="The image appears to be a screen or document with a text interface, showing various options and entries, including a mix of numbers, codes, and names.&#10;&#10;AI-generated content may be incorrect."/>
             <wp:cNvGraphicFramePr>
               <a:graphicFrameLocks xmlns:a="http://schemas.openxmlformats.org/drawingml/2006/main" noChangeAspect="1"/>
             </wp:cNvGraphicFramePr>
@@ -2760,7 +2760,7 @@
               <a:graphicData uri="http://schemas.openxmlformats.org/drawingml/2006/picture">
                 <pic:pic xmlns:pic="http://schemas.openxmlformats.org/drawingml/2006/picture">
                   <pic:nvPicPr>
-                    <pic:cNvPr id="1390158835" name=""/>
+                    <pic:cNvPr id="1390158835" name="Picture 1" descr="The image appears to be a screen or document with a text interface, showing various options and entries, including a mix of numbers, codes, and names.&#10;&#10;AI-generated content may be incorrect."/>
                     <pic:cNvPicPr/>
                   </pic:nvPicPr>
                   <pic:blipFill>
@@ -3149,7 +3149,7 @@
     <w:p>
       <w:pPr>
         <w:rPr>
-          <w:rFonts w:ascii="Helvetica" w:hAnsi="Helvetica"/>
+          <w:rFonts w:ascii="Sylfaen" w:hAnsi="Sylfaen"/>
           <w:sz w:val="22"/>
           <w:szCs w:val="22"/>
           <w:lang w:val="ka-GE"/>
@@ -3162,13 +3162,92 @@
           <w:szCs w:val="22"/>
           <w:lang w:val="ka-GE"/>
         </w:rPr>
+        <w:lastRenderedPageBreak/>
         <w:t xml:space="preserve">ისრების ნაცვლად მოქნილი ღილაკები გვჭირდება (მაგ. პაციენტის ანკეტაზე გადასასვლელად) </w:t>
+      </w:r>
+      <w:r>
+        <w:rPr>
+          <w:rFonts w:ascii="Helvetica" w:hAnsi="Helvetica"/>
+          <w:sz w:val="22"/>
+          <w:szCs w:val="22"/>
+          <w:lang w:val="ka-GE"/>
+        </w:rPr>
+        <w:t xml:space="preserve"> </w:t>
+      </w:r>
+      <w:r>
+        <w:rPr>
+          <w:rFonts w:ascii="Helvetica" w:hAnsi="Helvetica"/>
+          <w:sz w:val="22"/>
+          <w:szCs w:val="22"/>
+          <w:highlight w:val="yellow"/>
+          <w:lang w:val="ka-GE"/>
+        </w:rPr>
+        <w:t>&gt;&gt;</w:t>
+      </w:r>
+      <w:r>
+        <w:rPr>
+          <w:rFonts w:ascii="Sylfaen" w:hAnsi="Sylfaen"/>
+          <w:sz w:val="22"/>
+          <w:szCs w:val="22"/>
+          <w:highlight w:val="yellow"/>
+          <w:lang w:val="ka-GE"/>
+        </w:rPr>
+        <w:t>ვიზიტზევე გავაჩნე ეს ღილაკები. თუ ესაა ნაგულისხმები</w:t>
+      </w:r>
+      <w:r>
+        <w:rPr>
+          <w:rFonts w:ascii="Sylfaen" w:hAnsi="Sylfaen"/>
+          <w:sz w:val="22"/>
+          <w:szCs w:val="22"/>
+          <w:lang w:val="ka-GE"/>
+        </w:rPr>
+        <w:t xml:space="preserve"> </w:t>
+      </w:r>
+      <w:r>
+        <w:rPr>
+          <w:noProof/>
+        </w:rPr>
+        <w:drawing>
+          <wp:inline distT="0" distB="0" distL="0" distR="0" wp14:anchorId="6A0B708E" wp14:editId="13AAD366">
+            <wp:extent cx="5727700" cy="5575300"/>
+            <wp:effectExtent l="0" t="0" r="6350" b="6350"/>
+            <wp:docPr id="1525225826" name="Picture 1" descr="The image displays a meeting invitation in Odoo, with details such as the subject, start and end times, duration, attendees, and notes.&#10;&#10;AI-generated content may be incorrect."/>
+            <wp:cNvGraphicFramePr>
+              <a:graphicFrameLocks xmlns:a="http://schemas.openxmlformats.org/drawingml/2006/main" noChangeAspect="1"/>
+            </wp:cNvGraphicFramePr>
+            <a:graphic xmlns:a="http://schemas.openxmlformats.org/drawingml/2006/main">
+              <a:graphicData uri="http://schemas.openxmlformats.org/drawingml/2006/picture">
+                <pic:pic xmlns:pic="http://schemas.openxmlformats.org/drawingml/2006/picture">
+                  <pic:nvPicPr>
+                    <pic:cNvPr id="1525225826" name="Picture 1" descr="The image displays a meeting invitation in Odoo, with details such as the subject, start and end times, duration, attendees, and notes.&#10;&#10;AI-generated content may be incorrect."/>
+                    <pic:cNvPicPr/>
+                  </pic:nvPicPr>
+                  <pic:blipFill>
+                    <a:blip r:embed="rId30"/>
+                    <a:stretch>
+                      <a:fillRect/>
+                    </a:stretch>
+                  </pic:blipFill>
+                  <pic:spPr>
+                    <a:xfrm>
+                      <a:off x="0" y="0"/>
+                      <a:ext cx="5727700" cy="5575300"/>
+                    </a:xfrm>
+                    <a:prstGeom prst="rect">
+                      <a:avLst/>
+                    </a:prstGeom>
+                  </pic:spPr>
+                </pic:pic>
+              </a:graphicData>
+            </a:graphic>
+          </wp:inline>
+        </w:drawing>
       </w:r>
     </w:p>
     <w:p>
       <w:pPr>
         <w:rPr>
-          <w:rFonts w:ascii="Helvetica" w:hAnsi="Helvetica"/>
+          <w:rFonts w:ascii="Sylfaen" w:hAnsi="Sylfaen"/>
           <w:sz w:val="22"/>
           <w:szCs w:val="22"/>
           <w:lang w:val="ka-GE"/>
@@ -3183,6 +3262,84 @@
         </w:rPr>
         <w:br/>
         <w:t>თუ მიმდინარე პაციენტთან დროის ხანგრძლივობა შეიცვალა - კალენდარზე უნდა ჩანდეს რომ დაკორექტირდა</w:t>
+      </w:r>
+      <w:r>
+        <w:rPr>
+          <w:rFonts w:ascii="Helvetica" w:hAnsi="Helvetica"/>
+          <w:sz w:val="22"/>
+          <w:szCs w:val="22"/>
+          <w:lang w:val="ka-GE"/>
+        </w:rPr>
+        <w:t xml:space="preserve"> &gt;&gt; </w:t>
+      </w:r>
+      <w:r>
+        <w:rPr>
+          <w:rFonts w:ascii="Sylfaen" w:hAnsi="Sylfaen"/>
+          <w:sz w:val="22"/>
+          <w:szCs w:val="22"/>
+          <w:highlight w:val="yellow"/>
+          <w:lang w:val="ka-GE"/>
+        </w:rPr>
+        <w:t>ესე აჩვენმებს დაკორექტირებულ დროს</w:t>
+      </w:r>
+      <w:r>
+        <w:rPr>
+          <w:rFonts w:ascii="Sylfaen" w:hAnsi="Sylfaen"/>
+          <w:sz w:val="22"/>
+          <w:szCs w:val="22"/>
+          <w:lang w:val="ka-GE"/>
+        </w:rPr>
+        <w:t xml:space="preserve"> </w:t>
+      </w:r>
+      <w:r>
+        <w:rPr>
+          <w:rFonts w:ascii="Sylfaen" w:hAnsi="Sylfaen"/>
+          <w:sz w:val="22"/>
+          <w:szCs w:val="22"/>
+          <w:highlight w:val="yellow"/>
+          <w:lang w:val="ka-GE"/>
+        </w:rPr>
+        <w:t xml:space="preserve">ვიზიტზე </w:t>
+      </w:r>
+      <w:r>
+        <w:rPr>
+          <w:noProof/>
+        </w:rPr>
+        <w:drawing>
+          <wp:inline distT="0" distB="0" distL="0" distR="0" wp14:anchorId="30081FC0" wp14:editId="42B6E12A">
+            <wp:extent cx="3886200" cy="1333500"/>
+            <wp:effectExtent l="0" t="0" r="0" b="0"/>
+            <wp:docPr id="1406058703" name="Picture 1"/>
+            <wp:cNvGraphicFramePr>
+              <a:graphicFrameLocks xmlns:a="http://schemas.openxmlformats.org/drawingml/2006/main" noChangeAspect="1"/>
+            </wp:cNvGraphicFramePr>
+            <a:graphic xmlns:a="http://schemas.openxmlformats.org/drawingml/2006/main">
+              <a:graphicData uri="http://schemas.openxmlformats.org/drawingml/2006/picture">
+                <pic:pic xmlns:pic="http://schemas.openxmlformats.org/drawingml/2006/picture">
+                  <pic:nvPicPr>
+                    <pic:cNvPr id="1406058703" name=""/>
+                    <pic:cNvPicPr/>
+                  </pic:nvPicPr>
+                  <pic:blipFill>
+                    <a:blip r:embed="rId31"/>
+                    <a:stretch>
+                      <a:fillRect/>
+                    </a:stretch>
+                  </pic:blipFill>
+                  <pic:spPr>
+                    <a:xfrm>
+                      <a:off x="0" y="0"/>
+                      <a:ext cx="3886200" cy="1333500"/>
+                    </a:xfrm>
+                    <a:prstGeom prst="rect">
+                      <a:avLst/>
+                    </a:prstGeom>
+                  </pic:spPr>
+                </pic:pic>
+              </a:graphicData>
+            </a:graphic>
+          </wp:inline>
+        </w:drawing>
       </w:r>
       <w:r>
         <w:rPr>
@@ -3233,7 +3390,7 @@
                     <pic:cNvPicPr/>
                   </pic:nvPicPr>
                   <pic:blipFill>
-                    <a:blip r:embed="rId30"/>
+                    <a:blip r:embed="rId32"/>
                     <a:stretch>
                       <a:fillRect/>
                     </a:stretch>
@@ -3287,6 +3444,55 @@
           <w:szCs w:val="22"/>
           <w:lang w:val="ka-GE"/>
         </w:rPr>
+        <w:t xml:space="preserve"> &gt;&gt;&gt;</w:t>
+      </w:r>
+      <w:r>
+        <w:rPr>
+          <w:noProof/>
+        </w:rPr>
+        <w:drawing>
+          <wp:inline distT="0" distB="0" distL="0" distR="0" wp14:anchorId="58A194C1" wp14:editId="6FE8B5C4">
+            <wp:extent cx="5727700" cy="2345690"/>
+            <wp:effectExtent l="0" t="0" r="6350" b="0"/>
+            <wp:docPr id="1630609073" name="Picture 1"/>
+            <wp:cNvGraphicFramePr>
+              <a:graphicFrameLocks xmlns:a="http://schemas.openxmlformats.org/drawingml/2006/main" noChangeAspect="1"/>
+            </wp:cNvGraphicFramePr>
+            <a:graphic xmlns:a="http://schemas.openxmlformats.org/drawingml/2006/main">
+              <a:graphicData uri="http://schemas.openxmlformats.org/drawingml/2006/picture">
+                <pic:pic xmlns:pic="http://schemas.openxmlformats.org/drawingml/2006/picture">
+                  <pic:nvPicPr>
+                    <pic:cNvPr id="1630609073" name=""/>
+                    <pic:cNvPicPr/>
+                  </pic:nvPicPr>
+                  <pic:blipFill>
+                    <a:blip r:embed="rId33"/>
+                    <a:stretch>
+                      <a:fillRect/>
+                    </a:stretch>
+                  </pic:blipFill>
+                  <pic:spPr>
+                    <a:xfrm>
+                      <a:off x="0" y="0"/>
+                      <a:ext cx="5727700" cy="2345690"/>
+                    </a:xfrm>
+                    <a:prstGeom prst="rect">
+                      <a:avLst/>
+                    </a:prstGeom>
+                  </pic:spPr>
+                </pic:pic>
+              </a:graphicData>
+            </a:graphic>
+          </wp:inline>
+        </w:drawing>
+      </w:r>
+      <w:r>
+        <w:rPr>
+          <w:rFonts w:ascii="Helvetica" w:hAnsi="Helvetica"/>
+          <w:sz w:val="22"/>
+          <w:szCs w:val="22"/>
+          <w:lang w:val="ka-GE"/>
+        </w:rPr>
         <w:br/>
       </w:r>
       <w:r>
@@ -3359,6 +3565,34 @@
           <w:szCs w:val="22"/>
           <w:lang w:val="ka-GE"/>
         </w:rPr>
+        <w:t xml:space="preserve">&gt;&gt; </w:t>
+      </w:r>
+      <w:r>
+        <w:rPr>
+          <w:rFonts w:ascii="Sylfaen" w:hAnsi="Sylfaen"/>
+          <w:sz w:val="22"/>
+          <w:szCs w:val="22"/>
+          <w:highlight w:val="yellow"/>
+          <w:lang w:val="ka-GE"/>
+        </w:rPr>
+        <w:t>შემდეგ ვიზიტზე ღილაკზე რო ვაწვებით ყველაფერი ავტომატურად მოაქვს მათშორის წინა ვიზიტი საიდანაც წარმოიშვა</w:t>
+      </w:r>
+      <w:r>
+        <w:rPr>
+          <w:rFonts w:ascii="Sylfaen" w:hAnsi="Sylfaen"/>
+          <w:sz w:val="22"/>
+          <w:szCs w:val="22"/>
+          <w:lang w:val="ka-GE"/>
+        </w:rPr>
+        <w:t xml:space="preserve"> </w:t>
+      </w:r>
+      <w:r>
+        <w:rPr>
+          <w:rFonts w:ascii="Helvetica" w:hAnsi="Helvetica"/>
+          <w:sz w:val="22"/>
+          <w:szCs w:val="22"/>
+          <w:lang w:val="ka-GE"/>
+        </w:rPr>
         <w:br/>
       </w:r>
       <w:r>
@@ -3378,6 +3612,56 @@
           <w:szCs w:val="22"/>
           <w:lang w:val="ka-GE"/>
         </w:rPr>
+        <w:t>&gt;&gt;</w:t>
+      </w:r>
+      <w:r>
+        <w:rPr>
+          <w:noProof/>
+        </w:rPr>
+        <w:lastRenderedPageBreak/>
+        <w:drawing>
+          <wp:inline distT="0" distB="0" distL="0" distR="0" wp14:anchorId="27D56ED3" wp14:editId="73DC33D5">
+            <wp:extent cx="5727700" cy="3990340"/>
+            <wp:effectExtent l="0" t="0" r="6350" b="0"/>
+            <wp:docPr id="1874893483" name="Picture 1"/>
+            <wp:cNvGraphicFramePr>
+              <a:graphicFrameLocks xmlns:a="http://schemas.openxmlformats.org/drawingml/2006/main" noChangeAspect="1"/>
+            </wp:cNvGraphicFramePr>
+            <a:graphic xmlns:a="http://schemas.openxmlformats.org/drawingml/2006/main">
+              <a:graphicData uri="http://schemas.openxmlformats.org/drawingml/2006/picture">
+                <pic:pic xmlns:pic="http://schemas.openxmlformats.org/drawingml/2006/picture">
+                  <pic:nvPicPr>
+                    <pic:cNvPr id="1874893483" name=""/>
+                    <pic:cNvPicPr/>
+                  </pic:nvPicPr>
+                  <pic:blipFill>
+                    <a:blip r:embed="rId34"/>
+                    <a:stretch>
+                      <a:fillRect/>
+                    </a:stretch>
+                  </pic:blipFill>
+                  <pic:spPr>
+                    <a:xfrm>
+                      <a:off x="0" y="0"/>
+                      <a:ext cx="5727700" cy="3990340"/>
+                    </a:xfrm>
+                    <a:prstGeom prst="rect">
+                      <a:avLst/>
+                    </a:prstGeom>
+                  </pic:spPr>
+                </pic:pic>
+              </a:graphicData>
+            </a:graphic>
+          </wp:inline>
+        </w:drawing>
+      </w:r>
+      <w:r>
+        <w:rPr>
+          <w:rFonts w:ascii="Helvetica" w:hAnsi="Helvetica"/>
+          <w:sz w:val="22"/>
+          <w:szCs w:val="22"/>
+          <w:lang w:val="ka-GE"/>
+        </w:rPr>
         <w:br/>
       </w:r>
       <w:r>
@@ -3645,6 +3929,134 @@
         </w:rPr>
         <w:t xml:space="preserve"> </w:t>
       </w:r>
+      <w:r>
+        <w:rPr>
+          <w:rFonts w:ascii="Sylfaen" w:hAnsi="Sylfaen"/>
+          <w:sz w:val="22"/>
+          <w:szCs w:val="22"/>
+          <w:lang w:val="ka-GE"/>
+        </w:rPr>
+        <w:t xml:space="preserve"> </w:t>
+      </w:r>
+    </w:p>
+    <w:p>
+      <w:pPr>
+        <w:rPr>
+          <w:rFonts w:ascii="Sylfaen" w:hAnsi="Sylfaen"/>
+          <w:sz w:val="22"/>
+          <w:szCs w:val="22"/>
+          <w:lang w:val="ka-GE"/>
+        </w:rPr>
+      </w:pPr>
+      <w:r>
+        <w:rPr>
+          <w:rFonts w:ascii="Sylfaen" w:hAnsi="Sylfaen"/>
+          <w:sz w:val="22"/>
+          <w:szCs w:val="22"/>
+          <w:lang w:val="ka-GE"/>
+        </w:rPr>
+        <w:t xml:space="preserve">ასევე ამ ღილაკით ავტომატურად 6 თვის შემდეგ შეგიძლია ჩააგდო სარეზერვო ვიზიტებში &gt;&gt; </w:t>
+      </w:r>
+      <w:r>
+        <w:rPr>
+          <w:noProof/>
+        </w:rPr>
+        <w:lastRenderedPageBreak/>
+        <w:drawing>
+          <wp:inline distT="0" distB="0" distL="0" distR="0" wp14:anchorId="1169395C" wp14:editId="56EFDFBF">
+            <wp:extent cx="5727700" cy="3691890"/>
+            <wp:effectExtent l="0" t="0" r="6350" b="3810"/>
+            <wp:docPr id="1535885594" name="Picture 1"/>
+            <wp:cNvGraphicFramePr>
+              <a:graphicFrameLocks xmlns:a="http://schemas.openxmlformats.org/drawingml/2006/main" noChangeAspect="1"/>
+            </wp:cNvGraphicFramePr>
+            <a:graphic xmlns:a="http://schemas.openxmlformats.org/drawingml/2006/main">
+              <a:graphicData uri="http://schemas.openxmlformats.org/drawingml/2006/picture">
+                <pic:pic xmlns:pic="http://schemas.openxmlformats.org/drawingml/2006/picture">
+                  <pic:nvPicPr>
+                    <pic:cNvPr id="1535885594" name=""/>
+                    <pic:cNvPicPr/>
+                  </pic:nvPicPr>
+                  <pic:blipFill>
+                    <a:blip r:embed="rId35"/>
+                    <a:stretch>
+                      <a:fillRect/>
+                    </a:stretch>
+                  </pic:blipFill>
+                  <pic:spPr>
+                    <a:xfrm>
+                      <a:off x="0" y="0"/>
+                      <a:ext cx="5727700" cy="3691890"/>
+                    </a:xfrm>
+                    <a:prstGeom prst="rect">
+                      <a:avLst/>
+                    </a:prstGeom>
+                  </pic:spPr>
+                </pic:pic>
+              </a:graphicData>
+            </a:graphic>
+          </wp:inline>
+        </w:drawing>
+      </w:r>
+      <w:r>
+        <w:rPr>
+          <w:rFonts w:ascii="Sylfaen" w:hAnsi="Sylfaen"/>
+          <w:sz w:val="22"/>
+          <w:szCs w:val="22"/>
+          <w:lang w:val="ka-GE"/>
+        </w:rPr>
+        <w:t>&gt;&gt;&gt;</w:t>
+      </w:r>
+      <w:r>
+        <w:rPr>
+          <w:noProof/>
+        </w:rPr>
+        <w:drawing>
+          <wp:inline distT="0" distB="0" distL="0" distR="0" wp14:anchorId="22891854" wp14:editId="68C0A5B3">
+            <wp:extent cx="5727700" cy="3764280"/>
+            <wp:effectExtent l="0" t="0" r="6350" b="7620"/>
+            <wp:docPr id="784774032" name="Picture 1"/>
+            <wp:cNvGraphicFramePr>
+              <a:graphicFrameLocks xmlns:a="http://schemas.openxmlformats.org/drawingml/2006/main" noChangeAspect="1"/>
+            </wp:cNvGraphicFramePr>
+            <a:graphic xmlns:a="http://schemas.openxmlformats.org/drawingml/2006/main">
+              <a:graphicData uri="http://schemas.openxmlformats.org/drawingml/2006/picture">
+                <pic:pic xmlns:pic="http://schemas.openxmlformats.org/drawingml/2006/picture">
+                  <pic:nvPicPr>
+                    <pic:cNvPr id="784774032" name=""/>
+                    <pic:cNvPicPr/>
+                  </pic:nvPicPr>
+                  <pic:blipFill>
+                    <a:blip r:embed="rId36"/>
+                    <a:stretch>
+                      <a:fillRect/>
+                    </a:stretch>
+                  </pic:blipFill>
+                  <pic:spPr>
+                    <a:xfrm>
+                      <a:off x="0" y="0"/>
+                      <a:ext cx="5727700" cy="3764280"/>
+                    </a:xfrm>
+                    <a:prstGeom prst="rect">
+                      <a:avLst/>
+                    </a:prstGeom>
+                  </pic:spPr>
+                </pic:pic>
+              </a:graphicData>
+            </a:graphic>
+          </wp:inline>
+        </w:drawing>
+      </w:r>
+    </w:p>
+    <w:p>
+      <w:pPr>
+        <w:rPr>
+          <w:rFonts w:ascii="Helvetica" w:hAnsi="Helvetica"/>
+          <w:sz w:val="22"/>
+          <w:szCs w:val="22"/>
+          <w:lang w:val="ka-GE"/>
+        </w:rPr>
+      </w:pPr>
       <w:r>
         <w:rPr>
           <w:noProof/>
@@ -3666,7 +4078,7 @@
                     <pic:cNvPicPr/>
                   </pic:nvPicPr>
                   <pic:blipFill>
-                    <a:blip r:embed="rId31"/>
+                    <a:blip r:embed="rId37"/>
                     <a:stretch>
                       <a:fillRect/>
                     </a:stretch>

</xml_diff>